<commit_message>
report hub gui fix
</commit_message>
<xml_diff>
--- a/docs/Future development/Duncans wish list.docx
+++ b/docs/Future development/Duncans wish list.docx
@@ -12,21 +12,20 @@
         <w:rPr>
           <w:lang w:val="en-US"/>
         </w:rPr>
-        <w:t xml:space="preserve">Conjoint </w:t>
-      </w:r>
-      <w:proofErr w:type="spellStart"/>
-      <w:r>
+        <w:t xml:space="preserve">Conjoint gui </w:t>
+      </w:r>
+    </w:p>
+    <w:p>
+      <w:pPr>
         <w:rPr>
           <w:lang w:val="en-US"/>
         </w:rPr>
-        <w:t>gui</w:t>
-      </w:r>
-      <w:proofErr w:type="spellEnd"/>
+      </w:pPr>
       <w:r>
         <w:rPr>
           <w:lang w:val="en-US"/>
         </w:rPr>
-        <w:t xml:space="preserve"> </w:t>
+        <w:t>Pricing gui</w:t>
       </w:r>
     </w:p>
     <w:p>
@@ -39,66 +38,21 @@
         <w:rPr>
           <w:lang w:val="en-US"/>
         </w:rPr>
-        <w:t xml:space="preserve">Pricing </w:t>
-      </w:r>
-      <w:proofErr w:type="spellStart"/>
-      <w:r>
+        <w:t>Key driver gui</w:t>
+      </w:r>
+    </w:p>
+    <w:p>
+      <w:pPr>
         <w:rPr>
           <w:lang w:val="en-US"/>
         </w:rPr>
-        <w:t>gui</w:t>
-      </w:r>
-      <w:proofErr w:type="spellEnd"/>
-    </w:p>
-    <w:p>
-      <w:pPr>
+      </w:pPr>
+      <w:r>
         <w:rPr>
           <w:lang w:val="en-US"/>
         </w:rPr>
-      </w:pPr>
-      <w:r>
-        <w:rPr>
-          <w:lang w:val="en-US"/>
-        </w:rPr>
-        <w:t xml:space="preserve">Key driver </w:t>
-      </w:r>
-      <w:proofErr w:type="spellStart"/>
-      <w:r>
-        <w:rPr>
-          <w:lang w:val="en-US"/>
-        </w:rPr>
-        <w:t>gui</w:t>
-      </w:r>
-      <w:proofErr w:type="spellEnd"/>
-    </w:p>
-    <w:p>
-      <w:pPr>
-        <w:rPr>
-          <w:lang w:val="en-US"/>
-        </w:rPr>
-      </w:pPr>
-      <w:proofErr w:type="spellStart"/>
-      <w:r>
-        <w:rPr>
-          <w:lang w:val="en-US"/>
-        </w:rPr>
-        <w:t>Catdriver</w:t>
-      </w:r>
-      <w:proofErr w:type="spellEnd"/>
-      <w:r>
-        <w:rPr>
-          <w:lang w:val="en-US"/>
-        </w:rPr>
-        <w:t xml:space="preserve"> </w:t>
-      </w:r>
-      <w:proofErr w:type="spellStart"/>
-      <w:r>
-        <w:rPr>
-          <w:lang w:val="en-US"/>
-        </w:rPr>
-        <w:t>gui</w:t>
-      </w:r>
-      <w:proofErr w:type="spellEnd"/>
+        <w:t>Catdriver gui</w:t>
+      </w:r>
     </w:p>
     <w:p>
       <w:pPr>
@@ -248,37 +202,7 @@
           <w:lang w:eastAsia="en-GB"/>
           <w14:ligatures w14:val="none"/>
         </w:rPr>
-        <w:t xml:space="preserve">1. Marginal Effects for </w:t>
-      </w:r>
-      <w:proofErr w:type="spellStart"/>
-      <w:r>
-        <w:rPr>
-          <w:rFonts w:ascii="Segoe UI" w:eastAsia="Times New Roman" w:hAnsi="Segoe UI" w:cs="Segoe UI"/>
-          <w:b/>
-          <w:bCs/>
-          <w:color w:val="141413"/>
-          <w:kern w:val="0"/>
-          <w:sz w:val="36"/>
-          <w:szCs w:val="36"/>
-          <w:lang w:eastAsia="en-GB"/>
-          <w14:ligatures w14:val="none"/>
-        </w:rPr>
-        <w:t>Catdriver</w:t>
-      </w:r>
-      <w:proofErr w:type="spellEnd"/>
-      <w:r>
-        <w:rPr>
-          <w:rFonts w:ascii="Segoe UI" w:eastAsia="Times New Roman" w:hAnsi="Segoe UI" w:cs="Segoe UI"/>
-          <w:b/>
-          <w:bCs/>
-          <w:color w:val="141413"/>
-          <w:kern w:val="0"/>
-          <w:sz w:val="36"/>
-          <w:szCs w:val="36"/>
-          <w:lang w:eastAsia="en-GB"/>
-          <w14:ligatures w14:val="none"/>
-        </w:rPr>
-        <w:t xml:space="preserve"> -- LOW RISK</w:t>
+        <w:t>1. Marginal Effects for Catdriver -- LOW RISK</w:t>
       </w:r>
     </w:p>
     <w:p>
@@ -399,59 +323,7 @@
           <w:lang w:eastAsia="en-GB"/>
           <w14:ligatures w14:val="none"/>
         </w:rPr>
-        <w:t xml:space="preserve"> Moderate but clean. The </w:t>
-      </w:r>
-      <w:proofErr w:type="spellStart"/>
-      <w:r>
-        <w:rPr>
-          <w:rFonts w:ascii="Segoe UI" w:eastAsia="Times New Roman" w:hAnsi="Segoe UI" w:cs="Segoe UI"/>
-          <w:color w:val="141413"/>
-          <w:kern w:val="0"/>
-          <w:sz w:val="21"/>
-          <w:szCs w:val="21"/>
-          <w:lang w:eastAsia="en-GB"/>
-          <w14:ligatures w14:val="none"/>
-        </w:rPr>
-        <w:t>catdriver</w:t>
-      </w:r>
-      <w:proofErr w:type="spellEnd"/>
-      <w:r>
-        <w:rPr>
-          <w:rFonts w:ascii="Segoe UI" w:eastAsia="Times New Roman" w:hAnsi="Segoe UI" w:cs="Segoe UI"/>
-          <w:color w:val="141413"/>
-          <w:kern w:val="0"/>
-          <w:sz w:val="21"/>
-          <w:szCs w:val="21"/>
-          <w:lang w:eastAsia="en-GB"/>
-          <w14:ligatures w14:val="none"/>
-        </w:rPr>
-        <w:t xml:space="preserve"> report uses </w:t>
-      </w:r>
-      <w:proofErr w:type="spellStart"/>
-      <w:r>
-        <w:rPr>
-          <w:rFonts w:ascii="Segoe UI" w:eastAsia="Times New Roman" w:hAnsi="Segoe UI" w:cs="Segoe UI"/>
-          <w:color w:val="141413"/>
-          <w:kern w:val="0"/>
-          <w:sz w:val="21"/>
-          <w:szCs w:val="21"/>
-          <w:lang w:eastAsia="en-GB"/>
-          <w14:ligatures w14:val="none"/>
-        </w:rPr>
-        <w:t>htmltools</w:t>
-      </w:r>
-      <w:proofErr w:type="spellEnd"/>
-      <w:r>
-        <w:rPr>
-          <w:rFonts w:ascii="Segoe UI" w:eastAsia="Times New Roman" w:hAnsi="Segoe UI" w:cs="Segoe UI"/>
-          <w:color w:val="141413"/>
-          <w:kern w:val="0"/>
-          <w:sz w:val="21"/>
-          <w:szCs w:val="21"/>
-          <w:lang w:eastAsia="en-GB"/>
-          <w14:ligatures w14:val="none"/>
-        </w:rPr>
-        <w:t xml:space="preserve"> tag building with modular section builders. You'd add:</w:t>
+        <w:t> Moderate but clean. The catdriver report uses htmltools tag building with modular section builders. You'd add:</w:t>
       </w:r>
     </w:p>
     <w:p>
@@ -894,7 +766,6 @@
         </w:rPr>
         <w:t> Trivial. ~20 lines in </w:t>
       </w:r>
-      <w:proofErr w:type="spellStart"/>
       <w:r>
         <w:rPr>
           <w:rFonts w:ascii="Courier New" w:eastAsia="Times New Roman" w:hAnsi="Courier New" w:cs="Courier New"/>
@@ -908,7 +779,6 @@
         </w:rPr>
         <w:t>statistical_core.R</w:t>
       </w:r>
-      <w:proofErr w:type="spellEnd"/>
       <w:r>
         <w:rPr>
           <w:rFonts w:ascii="Segoe UI" w:eastAsia="Times New Roman" w:hAnsi="Segoe UI" w:cs="Segoe UI"/>
@@ -1407,7 +1277,6 @@
         </w:rPr>
         <w:t> ~100 lines. Linear regression across waves, 3-wave moving average. You already have </w:t>
       </w:r>
-      <w:proofErr w:type="spellStart"/>
       <w:r>
         <w:rPr>
           <w:rFonts w:ascii="Courier New" w:eastAsia="Times New Roman" w:hAnsi="Courier New" w:cs="Courier New"/>
@@ -1421,7 +1290,6 @@
         </w:rPr>
         <w:t>trend_calculator.R</w:t>
       </w:r>
-      <w:proofErr w:type="spellEnd"/>
       <w:r>
         <w:rPr>
           <w:rFonts w:ascii="Segoe UI" w:eastAsia="Times New Roman" w:hAnsi="Segoe UI" w:cs="Segoe UI"/>
@@ -1434,7 +1302,6 @@
         </w:rPr>
         <w:t> and </w:t>
       </w:r>
-      <w:proofErr w:type="spellStart"/>
       <w:r>
         <w:rPr>
           <w:rFonts w:ascii="Courier New" w:eastAsia="Times New Roman" w:hAnsi="Courier New" w:cs="Courier New"/>
@@ -1448,7 +1315,6 @@
         </w:rPr>
         <w:t>trend_changes.R</w:t>
       </w:r>
-      <w:proofErr w:type="spellEnd"/>
       <w:r>
         <w:rPr>
           <w:rFonts w:ascii="Segoe UI" w:eastAsia="Times New Roman" w:hAnsi="Segoe UI" w:cs="Segoe UI"/>
@@ -2120,39 +1986,7 @@
           <w:lang w:eastAsia="en-GB"/>
           <w14:ligatures w14:val="none"/>
         </w:rPr>
-        <w:t xml:space="preserve"> in </w:t>
-      </w:r>
-      <w:proofErr w:type="spellStart"/>
-      <w:r>
-        <w:rPr>
-          <w:rFonts w:ascii="Segoe UI" w:eastAsia="Times New Roman" w:hAnsi="Segoe UI" w:cs="Segoe UI"/>
-          <w:b/>
-          <w:bCs/>
-          <w:color w:val="141413"/>
-          <w:kern w:val="0"/>
-          <w:sz w:val="21"/>
-          <w:szCs w:val="21"/>
-          <w:bdr w:val="single" w:sz="2" w:space="0" w:color="1F1E1D" w:frame="1"/>
-          <w:lang w:eastAsia="en-GB"/>
-          <w14:ligatures w14:val="none"/>
-        </w:rPr>
-        <w:t>tryCatch</w:t>
-      </w:r>
-      <w:proofErr w:type="spellEnd"/>
-      <w:r>
-        <w:rPr>
-          <w:rFonts w:ascii="Segoe UI" w:eastAsia="Times New Roman" w:hAnsi="Segoe UI" w:cs="Segoe UI"/>
-          <w:b/>
-          <w:bCs/>
-          <w:color w:val="141413"/>
-          <w:kern w:val="0"/>
-          <w:sz w:val="21"/>
-          <w:szCs w:val="21"/>
-          <w:bdr w:val="single" w:sz="2" w:space="0" w:color="1F1E1D" w:frame="1"/>
-          <w:lang w:eastAsia="en-GB"/>
-          <w14:ligatures w14:val="none"/>
-        </w:rPr>
-        <w:t xml:space="preserve"> handlers (4 files)</w:t>
+        <w:t> in tryCatch handlers (4 files)</w:t>
       </w:r>
       <w:r>
         <w:rPr>
@@ -2416,7 +2250,6 @@
           <w14:ligatures w14:val="none"/>
         </w:rPr>
       </w:pPr>
-      <w:proofErr w:type="spellStart"/>
       <w:r>
         <w:rPr>
           <w:rFonts w:ascii="Courier New" w:eastAsia="Times New Roman" w:hAnsi="Courier New" w:cs="Courier New"/>
@@ -2428,9 +2261,20 @@
           <w:lang w:eastAsia="en-GB"/>
           <w14:ligatures w14:val="none"/>
         </w:rPr>
-        <w:t>as_logical_setting</w:t>
-      </w:r>
-      <w:proofErr w:type="spellEnd"/>
+        <w:t>as_logical_setting()</w:t>
+      </w:r>
+      <w:r>
+        <w:rPr>
+          <w:rFonts w:ascii="Segoe UI" w:eastAsia="Times New Roman" w:hAnsi="Segoe UI" w:cs="Segoe UI"/>
+          <w:color w:val="141413"/>
+          <w:kern w:val="0"/>
+          <w:sz w:val="21"/>
+          <w:szCs w:val="21"/>
+          <w:lang w:eastAsia="en-GB"/>
+          <w14:ligatures w14:val="none"/>
+        </w:rPr>
+        <w:t> / </w:t>
+      </w:r>
       <w:r>
         <w:rPr>
           <w:rFonts w:ascii="Courier New" w:eastAsia="Times New Roman" w:hAnsi="Courier New" w:cs="Courier New"/>
@@ -2442,100 +2286,20 @@
           <w:lang w:eastAsia="en-GB"/>
           <w14:ligatures w14:val="none"/>
         </w:rPr>
-        <w:t>()</w:t>
-      </w:r>
-      <w:r>
-        <w:rPr>
-          <w:rFonts w:ascii="Segoe UI" w:eastAsia="Times New Roman" w:hAnsi="Segoe UI" w:cs="Segoe UI"/>
-          <w:color w:val="141413"/>
-          <w:kern w:val="0"/>
-          <w:sz w:val="21"/>
-          <w:szCs w:val="21"/>
-          <w:lang w:eastAsia="en-GB"/>
-          <w14:ligatures w14:val="none"/>
-        </w:rPr>
-        <w:t> / </w:t>
-      </w:r>
-      <w:proofErr w:type="spellStart"/>
-      <w:r>
-        <w:rPr>
-          <w:rFonts w:ascii="Courier New" w:eastAsia="Times New Roman" w:hAnsi="Courier New" w:cs="Courier New"/>
-          <w:color w:val="8A2424"/>
-          <w:kern w:val="0"/>
-          <w:sz w:val="20"/>
-          <w:szCs w:val="20"/>
-          <w:bdr w:val="single" w:sz="2" w:space="0" w:color="auto" w:frame="1"/>
-          <w:lang w:eastAsia="en-GB"/>
-          <w14:ligatures w14:val="none"/>
-        </w:rPr>
-        <w:t>as_numeric_setting</w:t>
-      </w:r>
-      <w:proofErr w:type="spellEnd"/>
-      <w:r>
-        <w:rPr>
-          <w:rFonts w:ascii="Courier New" w:eastAsia="Times New Roman" w:hAnsi="Courier New" w:cs="Courier New"/>
-          <w:color w:val="8A2424"/>
-          <w:kern w:val="0"/>
-          <w:sz w:val="20"/>
-          <w:szCs w:val="20"/>
-          <w:bdr w:val="single" w:sz="2" w:space="0" w:color="auto" w:frame="1"/>
-          <w:lang w:eastAsia="en-GB"/>
-          <w14:ligatures w14:val="none"/>
-        </w:rPr>
-        <w:t>()</w:t>
-      </w:r>
-      <w:r>
-        <w:rPr>
-          <w:rFonts w:ascii="Segoe UI" w:eastAsia="Times New Roman" w:hAnsi="Segoe UI" w:cs="Segoe UI"/>
-          <w:color w:val="141413"/>
-          <w:kern w:val="0"/>
-          <w:sz w:val="21"/>
-          <w:szCs w:val="21"/>
-          <w:lang w:eastAsia="en-GB"/>
-          <w14:ligatures w14:val="none"/>
-        </w:rPr>
-        <w:t xml:space="preserve"> — duplicated in </w:t>
-      </w:r>
-      <w:proofErr w:type="spellStart"/>
-      <w:r>
-        <w:rPr>
-          <w:rFonts w:ascii="Segoe UI" w:eastAsia="Times New Roman" w:hAnsi="Segoe UI" w:cs="Segoe UI"/>
-          <w:color w:val="141413"/>
-          <w:kern w:val="0"/>
-          <w:sz w:val="21"/>
-          <w:szCs w:val="21"/>
-          <w:lang w:eastAsia="en-GB"/>
-          <w14:ligatures w14:val="none"/>
-        </w:rPr>
-        <w:t>catdriver</w:t>
-      </w:r>
-      <w:proofErr w:type="spellEnd"/>
-      <w:r>
-        <w:rPr>
-          <w:rFonts w:ascii="Segoe UI" w:eastAsia="Times New Roman" w:hAnsi="Segoe UI" w:cs="Segoe UI"/>
-          <w:color w:val="141413"/>
-          <w:kern w:val="0"/>
-          <w:sz w:val="21"/>
-          <w:szCs w:val="21"/>
-          <w:lang w:eastAsia="en-GB"/>
-          <w14:ligatures w14:val="none"/>
-        </w:rPr>
-        <w:t xml:space="preserve"> and </w:t>
-      </w:r>
-      <w:proofErr w:type="spellStart"/>
-      <w:r>
-        <w:rPr>
-          <w:rFonts w:ascii="Segoe UI" w:eastAsia="Times New Roman" w:hAnsi="Segoe UI" w:cs="Segoe UI"/>
-          <w:color w:val="141413"/>
-          <w:kern w:val="0"/>
-          <w:sz w:val="21"/>
-          <w:szCs w:val="21"/>
-          <w:lang w:eastAsia="en-GB"/>
-          <w14:ligatures w14:val="none"/>
-        </w:rPr>
-        <w:t>keydriver</w:t>
-      </w:r>
-      <w:proofErr w:type="spellEnd"/>
+        <w:t>as_numeric_setting()</w:t>
+      </w:r>
+      <w:r>
+        <w:rPr>
+          <w:rFonts w:ascii="Segoe UI" w:eastAsia="Times New Roman" w:hAnsi="Segoe UI" w:cs="Segoe UI"/>
+          <w:color w:val="141413"/>
+          <w:kern w:val="0"/>
+          <w:sz w:val="21"/>
+          <w:szCs w:val="21"/>
+          <w:lang w:eastAsia="en-GB"/>
+          <w14:ligatures w14:val="none"/>
+        </w:rPr>
+        <w:t> — duplicated in catdriver and keydriver</w:t>
+      </w:r>
     </w:p>
     <w:p>
       <w:pPr>
@@ -2561,7 +2325,6 @@
           <w14:ligatures w14:val="none"/>
         </w:rPr>
       </w:pPr>
-      <w:proofErr w:type="spellStart"/>
       <w:r>
         <w:rPr>
           <w:rFonts w:ascii="Courier New" w:eastAsia="Times New Roman" w:hAnsi="Courier New" w:cs="Courier New"/>
@@ -2573,48 +2336,20 @@
           <w:lang w:eastAsia="en-GB"/>
           <w14:ligatures w14:val="none"/>
         </w:rPr>
-        <w:t>calculate_deff</w:t>
-      </w:r>
-      <w:proofErr w:type="spellEnd"/>
-      <w:r>
-        <w:rPr>
-          <w:rFonts w:ascii="Courier New" w:eastAsia="Times New Roman" w:hAnsi="Courier New" w:cs="Courier New"/>
-          <w:color w:val="8A2424"/>
-          <w:kern w:val="0"/>
-          <w:sz w:val="20"/>
-          <w:szCs w:val="20"/>
-          <w:bdr w:val="single" w:sz="2" w:space="0" w:color="auto" w:frame="1"/>
-          <w:lang w:eastAsia="en-GB"/>
-          <w14:ligatures w14:val="none"/>
-        </w:rPr>
-        <w:t>()</w:t>
-      </w:r>
-      <w:r>
-        <w:rPr>
-          <w:rFonts w:ascii="Segoe UI" w:eastAsia="Times New Roman" w:hAnsi="Segoe UI" w:cs="Segoe UI"/>
-          <w:color w:val="141413"/>
-          <w:kern w:val="0"/>
-          <w:sz w:val="21"/>
-          <w:szCs w:val="21"/>
-          <w:lang w:eastAsia="en-GB"/>
-          <w14:ligatures w14:val="none"/>
-        </w:rPr>
-        <w:t xml:space="preserve"> — duplicated in confidence and </w:t>
-      </w:r>
-      <w:proofErr w:type="spellStart"/>
-      <w:r>
-        <w:rPr>
-          <w:rFonts w:ascii="Segoe UI" w:eastAsia="Times New Roman" w:hAnsi="Segoe UI" w:cs="Segoe UI"/>
-          <w:color w:val="141413"/>
-          <w:kern w:val="0"/>
-          <w:sz w:val="21"/>
-          <w:szCs w:val="21"/>
-          <w:lang w:eastAsia="en-GB"/>
-          <w14:ligatures w14:val="none"/>
-        </w:rPr>
-        <w:t>maxdiff</w:t>
-      </w:r>
-      <w:proofErr w:type="spellEnd"/>
+        <w:t>calculate_deff()</w:t>
+      </w:r>
+      <w:r>
+        <w:rPr>
+          <w:rFonts w:ascii="Segoe UI" w:eastAsia="Times New Roman" w:hAnsi="Segoe UI" w:cs="Segoe UI"/>
+          <w:color w:val="141413"/>
+          <w:kern w:val="0"/>
+          <w:sz w:val="21"/>
+          <w:szCs w:val="21"/>
+          <w:lang w:eastAsia="en-GB"/>
+          <w14:ligatures w14:val="none"/>
+        </w:rPr>
+        <w:t> — duplicated in confidence and maxdiff</w:t>
+      </w:r>
     </w:p>
     <w:p>
       <w:pPr>
@@ -2640,7 +2375,6 @@
           <w14:ligatures w14:val="none"/>
         </w:rPr>
       </w:pPr>
-      <w:proofErr w:type="spellStart"/>
       <w:r>
         <w:rPr>
           <w:rFonts w:ascii="Courier New" w:eastAsia="Times New Roman" w:hAnsi="Courier New" w:cs="Courier New"/>
@@ -2653,9 +2387,213 @@
           <w14:ligatures w14:val="none"/>
         </w:rPr>
         <w:lastRenderedPageBreak/>
-        <w:t>find_turas_root</w:t>
-      </w:r>
-      <w:proofErr w:type="spellEnd"/>
+        <w:t>find_turas_root()</w:t>
+      </w:r>
+      <w:r>
+        <w:rPr>
+          <w:rFonts w:ascii="Segoe UI" w:eastAsia="Times New Roman" w:hAnsi="Segoe UI" w:cs="Segoe UI"/>
+          <w:color w:val="141413"/>
+          <w:kern w:val="0"/>
+          <w:sz w:val="21"/>
+          <w:szCs w:val="21"/>
+          <w:lang w:eastAsia="en-GB"/>
+          <w14:ligatures w14:val="none"/>
+        </w:rPr>
+        <w:t> — duplicated in shared and keydriver</w:t>
+      </w:r>
+    </w:p>
+    <w:p>
+      <w:pPr>
+        <w:pBdr>
+          <w:top w:val="single" w:sz="2" w:space="0" w:color="1F1E1D"/>
+          <w:left w:val="single" w:sz="2" w:space="0" w:color="1F1E1D"/>
+          <w:bottom w:val="single" w:sz="2" w:space="0" w:color="1F1E1D"/>
+          <w:right w:val="single" w:sz="2" w:space="0" w:color="1F1E1D"/>
+        </w:pBdr>
+        <w:shd w:val="clear" w:color="auto" w:fill="FFFFFF"/>
+        <w:spacing w:before="120"/>
+        <w:rPr>
+          <w:rFonts w:ascii="Segoe UI" w:eastAsia="Times New Roman" w:hAnsi="Segoe UI" w:cs="Segoe UI"/>
+          <w:color w:val="141413"/>
+          <w:kern w:val="0"/>
+          <w:sz w:val="21"/>
+          <w:szCs w:val="21"/>
+          <w:lang w:eastAsia="en-GB"/>
+          <w14:ligatures w14:val="none"/>
+        </w:rPr>
+      </w:pPr>
+      <w:r>
+        <w:rPr>
+          <w:rFonts w:ascii="Segoe UI" w:eastAsia="Times New Roman" w:hAnsi="Segoe UI" w:cs="Segoe UI"/>
+          <w:b/>
+          <w:bCs/>
+          <w:color w:val="141413"/>
+          <w:kern w:val="0"/>
+          <w:sz w:val="21"/>
+          <w:szCs w:val="21"/>
+          <w:bdr w:val="single" w:sz="2" w:space="0" w:color="1F1E1D" w:frame="1"/>
+          <w:lang w:eastAsia="en-GB"/>
+          <w14:ligatures w14:val="none"/>
+        </w:rPr>
+        <w:t>3. Large files (13 files &gt;1000 lines)</w:t>
+      </w:r>
+      <w:r>
+        <w:rPr>
+          <w:rFonts w:ascii="Segoe UI" w:eastAsia="Times New Roman" w:hAnsi="Segoe UI" w:cs="Segoe UI"/>
+          <w:color w:val="141413"/>
+          <w:kern w:val="0"/>
+          <w:sz w:val="21"/>
+          <w:szCs w:val="21"/>
+          <w:lang w:eastAsia="en-GB"/>
+          <w14:ligatures w14:val="none"/>
+        </w:rPr>
+        <w:t> — Mostly HTML report builders. Functional but could be split for maintainability. Low priority since they work and are tested.</w:t>
+      </w:r>
+    </w:p>
+    <w:p>
+      <w:pPr>
+        <w:pBdr>
+          <w:top w:val="single" w:sz="2" w:space="0" w:color="1F1E1D"/>
+          <w:left w:val="single" w:sz="2" w:space="0" w:color="1F1E1D"/>
+          <w:bottom w:val="single" w:sz="2" w:space="0" w:color="1F1E1D"/>
+          <w:right w:val="single" w:sz="2" w:space="0" w:color="1F1E1D"/>
+        </w:pBdr>
+        <w:shd w:val="clear" w:color="auto" w:fill="FFFFFF"/>
+        <w:spacing w:before="120"/>
+        <w:rPr>
+          <w:rFonts w:ascii="Segoe UI" w:eastAsia="Times New Roman" w:hAnsi="Segoe UI" w:cs="Segoe UI"/>
+          <w:color w:val="141413"/>
+          <w:kern w:val="0"/>
+          <w:sz w:val="21"/>
+          <w:szCs w:val="21"/>
+          <w:lang w:eastAsia="en-GB"/>
+          <w14:ligatures w14:val="none"/>
+        </w:rPr>
+      </w:pPr>
+      <w:r>
+        <w:rPr>
+          <w:rFonts w:ascii="Segoe UI" w:eastAsia="Times New Roman" w:hAnsi="Segoe UI" w:cs="Segoe UI"/>
+          <w:color w:val="141413"/>
+          <w:kern w:val="0"/>
+          <w:sz w:val="21"/>
+          <w:szCs w:val="21"/>
+          <w:lang w:eastAsia="en-GB"/>
+          <w14:ligatures w14:val="none"/>
+        </w:rPr>
+        <w:t>These are all "nice to have" cleanups, not bugs. The platform is production-ready as-is. Want me to tackle items 1 and 2 now, or save them for a future session? They're low-risk refactors that would push the score closer to 95.</w:t>
+      </w:r>
+    </w:p>
+    <w:p>
+      <w:pPr>
+        <w:pBdr>
+          <w:top w:val="single" w:sz="2" w:space="0" w:color="1F1E1D"/>
+          <w:left w:val="single" w:sz="2" w:space="0" w:color="1F1E1D"/>
+          <w:bottom w:val="single" w:sz="2" w:space="0" w:color="1F1E1D"/>
+          <w:right w:val="single" w:sz="2" w:space="0" w:color="1F1E1D"/>
+        </w:pBdr>
+        <w:shd w:val="clear" w:color="auto" w:fill="FFFFFF"/>
+        <w:rPr>
+          <w:rFonts w:ascii="Segoe UI" w:eastAsia="Times New Roman" w:hAnsi="Segoe UI" w:cs="Segoe UI"/>
+          <w:color w:val="141413"/>
+          <w:kern w:val="0"/>
+          <w:sz w:val="21"/>
+          <w:szCs w:val="21"/>
+          <w:lang w:eastAsia="en-GB"/>
+          <w14:ligatures w14:val="none"/>
+        </w:rPr>
+      </w:pPr>
+      <w:r>
+        <w:rPr>
+          <w:rFonts w:ascii="Segoe UI" w:eastAsia="Times New Roman" w:hAnsi="Segoe UI" w:cs="Segoe UI"/>
+          <w:color w:val="141413"/>
+          <w:kern w:val="0"/>
+          <w:sz w:val="21"/>
+          <w:szCs w:val="21"/>
+          <w:lang w:eastAsia="en-GB"/>
+          <w14:ligatures w14:val="none"/>
+        </w:rPr>
+        <w:t>Packages already confirmed installed.</w:t>
+      </w:r>
+    </w:p>
+    <w:p>
+      <w:pPr>
+        <w:pBdr>
+          <w:top w:val="single" w:sz="2" w:space="0" w:color="1F1E1D"/>
+          <w:left w:val="single" w:sz="2" w:space="0" w:color="1F1E1D"/>
+          <w:bottom w:val="single" w:sz="2" w:space="0" w:color="1F1E1D"/>
+          <w:right w:val="single" w:sz="2" w:space="0" w:color="1F1E1D"/>
+        </w:pBdr>
+        <w:shd w:val="clear" w:color="auto" w:fill="FFFFFF"/>
+        <w:spacing w:before="120"/>
+        <w:rPr>
+          <w:rFonts w:ascii="Segoe UI" w:eastAsia="Times New Roman" w:hAnsi="Segoe UI" w:cs="Segoe UI"/>
+          <w:color w:val="141413"/>
+          <w:kern w:val="0"/>
+          <w:sz w:val="21"/>
+          <w:szCs w:val="21"/>
+          <w:lang w:eastAsia="en-GB"/>
+          <w14:ligatures w14:val="none"/>
+        </w:rPr>
+      </w:pPr>
+      <w:r>
+        <w:rPr>
+          <w:rFonts w:ascii="Segoe UI" w:eastAsia="Times New Roman" w:hAnsi="Segoe UI" w:cs="Segoe UI"/>
+          <w:color w:val="141413"/>
+          <w:kern w:val="0"/>
+          <w:sz w:val="21"/>
+          <w:szCs w:val="21"/>
+          <w:lang w:eastAsia="en-GB"/>
+          <w14:ligatures w14:val="none"/>
+        </w:rPr>
+        <w:t>To answer your question — those 2 medium-priority items (tryCatch stop→TRS, duplicate functions→shared) are the only remaining refactoring. Want me to do them now?</w:t>
+      </w:r>
+    </w:p>
+    <w:p>
+      <w:pPr>
+        <w:rPr>
+          <w:lang w:val="en-US"/>
+        </w:rPr>
+      </w:pPr>
+    </w:p>
+    <w:p>
+      <w:pPr>
+        <w:rPr>
+          <w:lang w:val="en-US"/>
+        </w:rPr>
+      </w:pPr>
+    </w:p>
+    <w:p>
+      <w:pPr>
+        <w:pBdr>
+          <w:top w:val="single" w:sz="2" w:space="0" w:color="1F1E1D"/>
+          <w:left w:val="single" w:sz="2" w:space="0" w:color="1F1E1D"/>
+          <w:bottom w:val="single" w:sz="2" w:space="0" w:color="1F1E1D"/>
+          <w:right w:val="single" w:sz="2" w:space="0" w:color="1F1E1D"/>
+        </w:pBdr>
+        <w:shd w:val="clear" w:color="auto" w:fill="FFFFFF"/>
+        <w:rPr>
+          <w:rFonts w:ascii="Segoe UI" w:eastAsia="Times New Roman" w:hAnsi="Segoe UI" w:cs="Segoe UI"/>
+          <w:color w:val="141413"/>
+          <w:kern w:val="0"/>
+          <w:sz w:val="27"/>
+          <w:szCs w:val="27"/>
+          <w:lang w:eastAsia="en-GB"/>
+          <w14:ligatures w14:val="none"/>
+        </w:rPr>
+      </w:pPr>
+      <w:r>
+        <w:rPr>
+          <w:rFonts w:ascii="Segoe UI" w:eastAsia="Times New Roman" w:hAnsi="Segoe UI" w:cs="Segoe UI"/>
+          <w:color w:val="141413"/>
+          <w:kern w:val="0"/>
+          <w:sz w:val="27"/>
+          <w:szCs w:val="27"/>
+          <w:lang w:eastAsia="en-GB"/>
+          <w14:ligatures w14:val="none"/>
+        </w:rPr>
+        <w:br/>
+        <w:t>Done. Your </w:t>
+      </w:r>
       <w:r>
         <w:rPr>
           <w:rFonts w:ascii="Courier New" w:eastAsia="Times New Roman" w:hAnsi="Courier New" w:cs="Courier New"/>
@@ -2667,34 +2605,20 @@
           <w:lang w:eastAsia="en-GB"/>
           <w14:ligatures w14:val="none"/>
         </w:rPr>
-        <w:t>()</w:t>
-      </w:r>
-      <w:r>
-        <w:rPr>
-          <w:rFonts w:ascii="Segoe UI" w:eastAsia="Times New Roman" w:hAnsi="Segoe UI" w:cs="Segoe UI"/>
-          <w:color w:val="141413"/>
-          <w:kern w:val="0"/>
-          <w:sz w:val="21"/>
-          <w:szCs w:val="21"/>
-          <w:lang w:eastAsia="en-GB"/>
-          <w14:ligatures w14:val="none"/>
-        </w:rPr>
-        <w:t xml:space="preserve"> — duplicated in shared and </w:t>
-      </w:r>
-      <w:proofErr w:type="spellStart"/>
-      <w:r>
-        <w:rPr>
-          <w:rFonts w:ascii="Segoe UI" w:eastAsia="Times New Roman" w:hAnsi="Segoe UI" w:cs="Segoe UI"/>
-          <w:color w:val="141413"/>
-          <w:kern w:val="0"/>
-          <w:sz w:val="21"/>
-          <w:szCs w:val="21"/>
-          <w:lang w:eastAsia="en-GB"/>
-          <w14:ligatures w14:val="none"/>
-        </w:rPr>
-        <w:t>keydriver</w:t>
-      </w:r>
-      <w:proofErr w:type="spellEnd"/>
+        <w:t>renv.lock</w:t>
+      </w:r>
+      <w:r>
+        <w:rPr>
+          <w:rFonts w:ascii="Segoe UI" w:eastAsia="Times New Roman" w:hAnsi="Segoe UI" w:cs="Segoe UI"/>
+          <w:color w:val="141413"/>
+          <w:kern w:val="0"/>
+          <w:sz w:val="27"/>
+          <w:szCs w:val="27"/>
+          <w:lang w:eastAsia="en-GB"/>
+          <w14:ligatures w14:val="none"/>
+        </w:rPr>
+        <w:t> now captures all 219+ packages at their exact current versions.</w:t>
+      </w:r>
     </w:p>
     <w:p>
       <w:pPr>
@@ -2710,8 +2634,180 @@
           <w:rFonts w:ascii="Segoe UI" w:eastAsia="Times New Roman" w:hAnsi="Segoe UI" w:cs="Segoe UI"/>
           <w:color w:val="141413"/>
           <w:kern w:val="0"/>
-          <w:sz w:val="21"/>
-          <w:szCs w:val="21"/>
+          <w:sz w:val="27"/>
+          <w:szCs w:val="27"/>
+          <w:lang w:eastAsia="en-GB"/>
+          <w14:ligatures w14:val="none"/>
+        </w:rPr>
+      </w:pPr>
+      <w:r>
+        <w:rPr>
+          <w:rFonts w:ascii="Segoe UI" w:eastAsia="Times New Roman" w:hAnsi="Segoe UI" w:cs="Segoe UI"/>
+          <w:color w:val="141413"/>
+          <w:kern w:val="0"/>
+          <w:sz w:val="27"/>
+          <w:szCs w:val="27"/>
+          <w:lang w:eastAsia="en-GB"/>
+          <w14:ligatures w14:val="none"/>
+        </w:rPr>
+        <w:t>Go ahead and merge </w:t>
+      </w:r>
+      <w:r>
+        <w:rPr>
+          <w:rFonts w:ascii="Courier New" w:eastAsia="Times New Roman" w:hAnsi="Courier New" w:cs="Courier New"/>
+          <w:color w:val="8A2424"/>
+          <w:kern w:val="0"/>
+          <w:sz w:val="20"/>
+          <w:szCs w:val="20"/>
+          <w:bdr w:val="single" w:sz="2" w:space="0" w:color="auto" w:frame="1"/>
+          <w:lang w:eastAsia="en-GB"/>
+          <w14:ligatures w14:val="none"/>
+        </w:rPr>
+        <w:t>feature/visual-polish</w:t>
+      </w:r>
+      <w:r>
+        <w:rPr>
+          <w:rFonts w:ascii="Segoe UI" w:eastAsia="Times New Roman" w:hAnsi="Segoe UI" w:cs="Segoe UI"/>
+          <w:color w:val="141413"/>
+          <w:kern w:val="0"/>
+          <w:sz w:val="27"/>
+          <w:szCs w:val="27"/>
+          <w:lang w:eastAsia="en-GB"/>
+          <w14:ligatures w14:val="none"/>
+        </w:rPr>
+        <w:t> → </w:t>
+      </w:r>
+      <w:r>
+        <w:rPr>
+          <w:rFonts w:ascii="Courier New" w:eastAsia="Times New Roman" w:hAnsi="Courier New" w:cs="Courier New"/>
+          <w:color w:val="8A2424"/>
+          <w:kern w:val="0"/>
+          <w:sz w:val="20"/>
+          <w:szCs w:val="20"/>
+          <w:bdr w:val="single" w:sz="2" w:space="0" w:color="auto" w:frame="1"/>
+          <w:lang w:eastAsia="en-GB"/>
+          <w14:ligatures w14:val="none"/>
+        </w:rPr>
+        <w:t>main</w:t>
+      </w:r>
+      <w:r>
+        <w:rPr>
+          <w:rFonts w:ascii="Segoe UI" w:eastAsia="Times New Roman" w:hAnsi="Segoe UI" w:cs="Segoe UI"/>
+          <w:color w:val="141413"/>
+          <w:kern w:val="0"/>
+          <w:sz w:val="27"/>
+          <w:szCs w:val="27"/>
+          <w:lang w:eastAsia="en-GB"/>
+          <w14:ligatures w14:val="none"/>
+        </w:rPr>
+        <w:t> from GitHub Desktop. Make sure </w:t>
+      </w:r>
+      <w:r>
+        <w:rPr>
+          <w:rFonts w:ascii="Courier New" w:eastAsia="Times New Roman" w:hAnsi="Courier New" w:cs="Courier New"/>
+          <w:color w:val="8A2424"/>
+          <w:kern w:val="0"/>
+          <w:sz w:val="20"/>
+          <w:szCs w:val="20"/>
+          <w:bdr w:val="single" w:sz="2" w:space="0" w:color="auto" w:frame="1"/>
+          <w:lang w:eastAsia="en-GB"/>
+          <w14:ligatures w14:val="none"/>
+        </w:rPr>
+        <w:t>renv.lock</w:t>
+      </w:r>
+      <w:r>
+        <w:rPr>
+          <w:rFonts w:ascii="Segoe UI" w:eastAsia="Times New Roman" w:hAnsi="Segoe UI" w:cs="Segoe UI"/>
+          <w:color w:val="141413"/>
+          <w:kern w:val="0"/>
+          <w:sz w:val="27"/>
+          <w:szCs w:val="27"/>
+          <w:lang w:eastAsia="en-GB"/>
+          <w14:ligatures w14:val="none"/>
+        </w:rPr>
+        <w:t> is included in the commit.</w:t>
+      </w:r>
+    </w:p>
+    <w:p>
+      <w:pPr>
+        <w:pBdr>
+          <w:top w:val="single" w:sz="2" w:space="0" w:color="1F1E1D"/>
+          <w:left w:val="single" w:sz="2" w:space="0" w:color="1F1E1D"/>
+          <w:bottom w:val="single" w:sz="2" w:space="0" w:color="1F1E1D"/>
+          <w:right w:val="single" w:sz="2" w:space="0" w:color="1F1E1D"/>
+        </w:pBdr>
+        <w:shd w:val="clear" w:color="auto" w:fill="F5F4ED"/>
+        <w:rPr>
+          <w:rFonts w:ascii="Segoe UI" w:eastAsia="Times New Roman" w:hAnsi="Segoe UI" w:cs="Segoe UI"/>
+          <w:color w:val="141413"/>
+          <w:kern w:val="0"/>
+          <w:sz w:val="27"/>
+          <w:szCs w:val="27"/>
+          <w:lang w:eastAsia="en-GB"/>
+          <w14:ligatures w14:val="none"/>
+        </w:rPr>
+      </w:pPr>
+      <w:r>
+        <w:rPr>
+          <w:rFonts w:ascii="Segoe UI" w:eastAsia="Times New Roman" w:hAnsi="Segoe UI" w:cs="Segoe UI"/>
+          <w:color w:val="141413"/>
+          <w:kern w:val="0"/>
+          <w:sz w:val="27"/>
+          <w:szCs w:val="27"/>
+          <w:lang w:eastAsia="en-GB"/>
+          <w14:ligatures w14:val="none"/>
+        </w:rPr>
+        <w:t>ok done. now what</w:t>
+      </w:r>
+    </w:p>
+    <w:p>
+      <w:pPr>
+        <w:pBdr>
+          <w:top w:val="single" w:sz="2" w:space="0" w:color="1F1E1D"/>
+          <w:left w:val="single" w:sz="2" w:space="0" w:color="1F1E1D"/>
+          <w:bottom w:val="single" w:sz="2" w:space="0" w:color="1F1E1D"/>
+          <w:right w:val="single" w:sz="2" w:space="0" w:color="1F1E1D"/>
+        </w:pBdr>
+        <w:shd w:val="clear" w:color="auto" w:fill="FFFFFF"/>
+        <w:rPr>
+          <w:rFonts w:ascii="Segoe UI" w:eastAsia="Times New Roman" w:hAnsi="Segoe UI" w:cs="Segoe UI"/>
+          <w:color w:val="141413"/>
+          <w:kern w:val="0"/>
+          <w:sz w:val="27"/>
+          <w:szCs w:val="27"/>
+          <w:lang w:eastAsia="en-GB"/>
+          <w14:ligatures w14:val="none"/>
+        </w:rPr>
+      </w:pPr>
+      <w:r>
+        <w:rPr>
+          <w:rFonts w:ascii="Segoe UI" w:eastAsia="Times New Roman" w:hAnsi="Segoe UI" w:cs="Segoe UI"/>
+          <w:color w:val="141413"/>
+          <w:kern w:val="0"/>
+          <w:sz w:val="27"/>
+          <w:szCs w:val="27"/>
+          <w:lang w:eastAsia="en-GB"/>
+          <w14:ligatures w14:val="none"/>
+        </w:rPr>
+        <w:t>You're done. The merge is complete. Here's what was accomplished across this session:</w:t>
+      </w:r>
+    </w:p>
+    <w:p>
+      <w:pPr>
+        <w:pBdr>
+          <w:top w:val="single" w:sz="2" w:space="0" w:color="1F1E1D"/>
+          <w:left w:val="single" w:sz="2" w:space="0" w:color="1F1E1D"/>
+          <w:bottom w:val="single" w:sz="2" w:space="0" w:color="1F1E1D"/>
+          <w:right w:val="single" w:sz="2" w:space="0" w:color="1F1E1D"/>
+        </w:pBdr>
+        <w:shd w:val="clear" w:color="auto" w:fill="FFFFFF"/>
+        <w:spacing w:before="120"/>
+        <w:rPr>
+          <w:rFonts w:ascii="Segoe UI" w:eastAsia="Times New Roman" w:hAnsi="Segoe UI" w:cs="Segoe UI"/>
+          <w:color w:val="141413"/>
+          <w:kern w:val="0"/>
+          <w:sz w:val="27"/>
+          <w:szCs w:val="27"/>
           <w:lang w:eastAsia="en-GB"/>
           <w14:ligatures w14:val="none"/>
         </w:rPr>
@@ -2723,25 +2819,262 @@
           <w:bCs/>
           <w:color w:val="141413"/>
           <w:kern w:val="0"/>
-          <w:sz w:val="21"/>
-          <w:szCs w:val="21"/>
+          <w:sz w:val="27"/>
+          <w:szCs w:val="27"/>
           <w:bdr w:val="single" w:sz="2" w:space="0" w:color="1F1E1D" w:frame="1"/>
           <w:lang w:eastAsia="en-GB"/>
           <w14:ligatures w14:val="none"/>
         </w:rPr>
-        <w:t>3. Large files (13 files &gt;1000 lines)</w:t>
-      </w:r>
-      <w:r>
-        <w:rPr>
-          <w:rFonts w:ascii="Segoe UI" w:eastAsia="Times New Roman" w:hAnsi="Segoe UI" w:cs="Segoe UI"/>
-          <w:color w:val="141413"/>
-          <w:kern w:val="0"/>
-          <w:sz w:val="21"/>
-          <w:szCs w:val="21"/>
-          <w:lang w:eastAsia="en-GB"/>
-          <w14:ligatures w14:val="none"/>
-        </w:rPr>
-        <w:t> — Mostly HTML report builders. Functional but could be split for maintainability. Low priority since they work and are tested.</w:t>
+        <w:t>Fixes delivered:</w:t>
+      </w:r>
+    </w:p>
+    <w:p>
+      <w:pPr>
+        <w:numPr>
+          <w:ilvl w:val="0"/>
+          <w:numId w:val="6"/>
+        </w:numPr>
+        <w:pBdr>
+          <w:top w:val="single" w:sz="2" w:space="0" w:color="1F1E1D"/>
+          <w:left w:val="single" w:sz="2" w:space="0" w:color="1F1E1D"/>
+          <w:bottom w:val="single" w:sz="2" w:space="0" w:color="1F1E1D"/>
+          <w:right w:val="single" w:sz="2" w:space="0" w:color="1F1E1D"/>
+        </w:pBdr>
+        <w:shd w:val="clear" w:color="auto" w:fill="FFFFFF"/>
+        <w:spacing w:before="100" w:beforeAutospacing="1" w:after="100" w:afterAutospacing="1"/>
+        <w:rPr>
+          <w:rFonts w:ascii="Segoe UI" w:eastAsia="Times New Roman" w:hAnsi="Segoe UI" w:cs="Segoe UI"/>
+          <w:color w:val="141413"/>
+          <w:kern w:val="0"/>
+          <w:sz w:val="27"/>
+          <w:szCs w:val="27"/>
+          <w:lang w:eastAsia="en-GB"/>
+          <w14:ligatures w14:val="none"/>
+        </w:rPr>
+      </w:pPr>
+      <w:r>
+        <w:rPr>
+          <w:rFonts w:ascii="Segoe UI" w:eastAsia="Times New Roman" w:hAnsi="Segoe UI" w:cs="Segoe UI"/>
+          <w:color w:val="141413"/>
+          <w:kern w:val="0"/>
+          <w:sz w:val="27"/>
+          <w:szCs w:val="27"/>
+          <w:lang w:eastAsia="en-GB"/>
+          <w14:ligatures w14:val="none"/>
+        </w:rPr>
+        <w:t>KeyDriver dominance analysis — updated for </w:t>
+      </w:r>
+      <w:r>
+        <w:rPr>
+          <w:rFonts w:ascii="Courier New" w:eastAsia="Times New Roman" w:hAnsi="Courier New" w:cs="Courier New"/>
+          <w:color w:val="8A2424"/>
+          <w:kern w:val="0"/>
+          <w:sz w:val="20"/>
+          <w:szCs w:val="20"/>
+          <w:bdr w:val="single" w:sz="2" w:space="0" w:color="auto" w:frame="1"/>
+          <w:lang w:eastAsia="en-GB"/>
+          <w14:ligatures w14:val="none"/>
+        </w:rPr>
+        <w:t>domir</w:t>
+      </w:r>
+      <w:r>
+        <w:rPr>
+          <w:rFonts w:ascii="Segoe UI" w:eastAsia="Times New Roman" w:hAnsi="Segoe UI" w:cs="Segoe UI"/>
+          <w:color w:val="141413"/>
+          <w:kern w:val="0"/>
+          <w:sz w:val="27"/>
+          <w:szCs w:val="27"/>
+          <w:lang w:eastAsia="en-GB"/>
+          <w14:ligatures w14:val="none"/>
+        </w:rPr>
+        <w:t> v1.2.0 API change</w:t>
+      </w:r>
+    </w:p>
+    <w:p>
+      <w:pPr>
+        <w:numPr>
+          <w:ilvl w:val="0"/>
+          <w:numId w:val="6"/>
+        </w:numPr>
+        <w:pBdr>
+          <w:top w:val="single" w:sz="2" w:space="0" w:color="1F1E1D"/>
+          <w:left w:val="single" w:sz="2" w:space="0" w:color="1F1E1D"/>
+          <w:bottom w:val="single" w:sz="2" w:space="0" w:color="1F1E1D"/>
+          <w:right w:val="single" w:sz="2" w:space="0" w:color="1F1E1D"/>
+        </w:pBdr>
+        <w:shd w:val="clear" w:color="auto" w:fill="FFFFFF"/>
+        <w:spacing w:before="60"/>
+        <w:rPr>
+          <w:rFonts w:ascii="Segoe UI" w:eastAsia="Times New Roman" w:hAnsi="Segoe UI" w:cs="Segoe UI"/>
+          <w:color w:val="141413"/>
+          <w:kern w:val="0"/>
+          <w:sz w:val="27"/>
+          <w:szCs w:val="27"/>
+          <w:lang w:eastAsia="en-GB"/>
+          <w14:ligatures w14:val="none"/>
+        </w:rPr>
+      </w:pPr>
+      <w:r>
+        <w:rPr>
+          <w:rFonts w:ascii="Segoe UI" w:eastAsia="Times New Roman" w:hAnsi="Segoe UI" w:cs="Segoe UI"/>
+          <w:color w:val="141413"/>
+          <w:kern w:val="0"/>
+          <w:sz w:val="27"/>
+          <w:szCs w:val="27"/>
+          <w:lang w:eastAsia="en-GB"/>
+          <w14:ligatures w14:val="none"/>
+        </w:rPr>
+        <w:t>Conjoint MNL tests — qualified </w:t>
+      </w:r>
+      <w:r>
+        <w:rPr>
+          <w:rFonts w:ascii="Courier New" w:eastAsia="Times New Roman" w:hAnsi="Courier New" w:cs="Courier New"/>
+          <w:color w:val="8A2424"/>
+          <w:kern w:val="0"/>
+          <w:sz w:val="20"/>
+          <w:szCs w:val="20"/>
+          <w:bdr w:val="single" w:sz="2" w:space="0" w:color="auto" w:frame="1"/>
+          <w:lang w:eastAsia="en-GB"/>
+          <w14:ligatures w14:val="none"/>
+        </w:rPr>
+        <w:t>dplyr::count()</w:t>
+      </w:r>
+      <w:r>
+        <w:rPr>
+          <w:rFonts w:ascii="Segoe UI" w:eastAsia="Times New Roman" w:hAnsi="Segoe UI" w:cs="Segoe UI"/>
+          <w:color w:val="141413"/>
+          <w:kern w:val="0"/>
+          <w:sz w:val="27"/>
+          <w:szCs w:val="27"/>
+          <w:lang w:eastAsia="en-GB"/>
+          <w14:ligatures w14:val="none"/>
+        </w:rPr>
+        <w:t> calls to prevent masking</w:t>
+      </w:r>
+    </w:p>
+    <w:p>
+      <w:pPr>
+        <w:numPr>
+          <w:ilvl w:val="0"/>
+          <w:numId w:val="6"/>
+        </w:numPr>
+        <w:pBdr>
+          <w:top w:val="single" w:sz="2" w:space="0" w:color="1F1E1D"/>
+          <w:left w:val="single" w:sz="2" w:space="0" w:color="1F1E1D"/>
+          <w:bottom w:val="single" w:sz="2" w:space="0" w:color="1F1E1D"/>
+          <w:right w:val="single" w:sz="2" w:space="0" w:color="1F1E1D"/>
+        </w:pBdr>
+        <w:shd w:val="clear" w:color="auto" w:fill="FFFFFF"/>
+        <w:spacing w:before="60"/>
+        <w:rPr>
+          <w:rFonts w:ascii="Segoe UI" w:eastAsia="Times New Roman" w:hAnsi="Segoe UI" w:cs="Segoe UI"/>
+          <w:color w:val="141413"/>
+          <w:kern w:val="0"/>
+          <w:sz w:val="27"/>
+          <w:szCs w:val="27"/>
+          <w:lang w:eastAsia="en-GB"/>
+          <w14:ligatures w14:val="none"/>
+        </w:rPr>
+      </w:pPr>
+      <w:r>
+        <w:rPr>
+          <w:rFonts w:ascii="Segoe UI" w:eastAsia="Times New Roman" w:hAnsi="Segoe UI" w:cs="Segoe UI"/>
+          <w:color w:val="141413"/>
+          <w:kern w:val="0"/>
+          <w:sz w:val="27"/>
+          <w:szCs w:val="27"/>
+          <w:lang w:eastAsia="en-GB"/>
+          <w14:ligatures w14:val="none"/>
+        </w:rPr>
+        <w:t>KeyDriver test path resolution — 17 test files fixed to use </w:t>
+      </w:r>
+      <w:r>
+        <w:rPr>
+          <w:rFonts w:ascii="Courier New" w:eastAsia="Times New Roman" w:hAnsi="Courier New" w:cs="Courier New"/>
+          <w:color w:val="8A2424"/>
+          <w:kern w:val="0"/>
+          <w:sz w:val="20"/>
+          <w:szCs w:val="20"/>
+          <w:bdr w:val="single" w:sz="2" w:space="0" w:color="auto" w:frame="1"/>
+          <w:lang w:eastAsia="en-GB"/>
+          <w14:ligatures w14:val="none"/>
+        </w:rPr>
+        <w:t>helper-paths.R</w:t>
+      </w:r>
+    </w:p>
+    <w:p>
+      <w:pPr>
+        <w:numPr>
+          <w:ilvl w:val="0"/>
+          <w:numId w:val="6"/>
+        </w:numPr>
+        <w:pBdr>
+          <w:top w:val="single" w:sz="2" w:space="0" w:color="1F1E1D"/>
+          <w:left w:val="single" w:sz="2" w:space="0" w:color="1F1E1D"/>
+          <w:bottom w:val="single" w:sz="2" w:space="0" w:color="1F1E1D"/>
+          <w:right w:val="single" w:sz="2" w:space="0" w:color="1F1E1D"/>
+        </w:pBdr>
+        <w:shd w:val="clear" w:color="auto" w:fill="FFFFFF"/>
+        <w:spacing w:before="60"/>
+        <w:rPr>
+          <w:rFonts w:ascii="Segoe UI" w:eastAsia="Times New Roman" w:hAnsi="Segoe UI" w:cs="Segoe UI"/>
+          <w:color w:val="141413"/>
+          <w:kern w:val="0"/>
+          <w:sz w:val="27"/>
+          <w:szCs w:val="27"/>
+          <w:lang w:eastAsia="en-GB"/>
+          <w14:ligatures w14:val="none"/>
+        </w:rPr>
+      </w:pPr>
+      <w:r>
+        <w:rPr>
+          <w:rFonts w:ascii="Segoe UI" w:eastAsia="Times New Roman" w:hAnsi="Segoe UI" w:cs="Segoe UI"/>
+          <w:color w:val="141413"/>
+          <w:kern w:val="0"/>
+          <w:sz w:val="27"/>
+          <w:szCs w:val="27"/>
+          <w:lang w:eastAsia="en-GB"/>
+          <w14:ligatures w14:val="none"/>
+        </w:rPr>
+        <w:t>Package update safety tooling — </w:t>
+      </w:r>
+      <w:r>
+        <w:rPr>
+          <w:rFonts w:ascii="Courier New" w:eastAsia="Times New Roman" w:hAnsi="Courier New" w:cs="Courier New"/>
+          <w:color w:val="8A2424"/>
+          <w:kern w:val="0"/>
+          <w:sz w:val="20"/>
+          <w:szCs w:val="20"/>
+          <w:bdr w:val="single" w:sz="2" w:space="0" w:color="auto" w:frame="1"/>
+          <w:lang w:eastAsia="en-GB"/>
+          <w14:ligatures w14:val="none"/>
+        </w:rPr>
+        <w:t>tools/safe_package_update.R</w:t>
+      </w:r>
+      <w:r>
+        <w:rPr>
+          <w:rFonts w:ascii="Segoe UI" w:eastAsia="Times New Roman" w:hAnsi="Segoe UI" w:cs="Segoe UI"/>
+          <w:color w:val="141413"/>
+          <w:kern w:val="0"/>
+          <w:sz w:val="27"/>
+          <w:szCs w:val="27"/>
+          <w:lang w:eastAsia="en-GB"/>
+          <w14:ligatures w14:val="none"/>
+        </w:rPr>
+        <w:t> and </w:t>
+      </w:r>
+      <w:r>
+        <w:rPr>
+          <w:rFonts w:ascii="Courier New" w:eastAsia="Times New Roman" w:hAnsi="Courier New" w:cs="Courier New"/>
+          <w:color w:val="8A2424"/>
+          <w:kern w:val="0"/>
+          <w:sz w:val="20"/>
+          <w:szCs w:val="20"/>
+          <w:bdr w:val="single" w:sz="2" w:space="0" w:color="auto" w:frame="1"/>
+          <w:lang w:eastAsia="en-GB"/>
+          <w14:ligatures w14:val="none"/>
+        </w:rPr>
+        <w:t>tools/PACKAGE_UPDATE_GUIDE.md</w:t>
       </w:r>
     </w:p>
     <w:p>
@@ -2758,27 +3091,34 @@
           <w:rFonts w:ascii="Segoe UI" w:eastAsia="Times New Roman" w:hAnsi="Segoe UI" w:cs="Segoe UI"/>
           <w:color w:val="141413"/>
           <w:kern w:val="0"/>
-          <w:sz w:val="21"/>
-          <w:szCs w:val="21"/>
-          <w:lang w:eastAsia="en-GB"/>
-          <w14:ligatures w14:val="none"/>
-        </w:rPr>
-      </w:pPr>
-      <w:r>
-        <w:rPr>
-          <w:rFonts w:ascii="Segoe UI" w:eastAsia="Times New Roman" w:hAnsi="Segoe UI" w:cs="Segoe UI"/>
-          <w:color w:val="141413"/>
-          <w:kern w:val="0"/>
-          <w:sz w:val="21"/>
-          <w:szCs w:val="21"/>
-          <w:lang w:eastAsia="en-GB"/>
-          <w14:ligatures w14:val="none"/>
-        </w:rPr>
-        <w:t>These are all "nice to have" cleanups, not bugs. The platform is production-ready as-is. Want me to tackle items 1 and 2 now, or save them for a future session? They're low-risk refactors that would push the score closer to 95.</w:t>
-      </w:r>
-    </w:p>
-    <w:p>
-      <w:pPr>
+          <w:sz w:val="27"/>
+          <w:szCs w:val="27"/>
+          <w:lang w:eastAsia="en-GB"/>
+          <w14:ligatures w14:val="none"/>
+        </w:rPr>
+      </w:pPr>
+      <w:r>
+        <w:rPr>
+          <w:rFonts w:ascii="Segoe UI" w:eastAsia="Times New Roman" w:hAnsi="Segoe UI" w:cs="Segoe UI"/>
+          <w:b/>
+          <w:bCs/>
+          <w:color w:val="141413"/>
+          <w:kern w:val="0"/>
+          <w:sz w:val="27"/>
+          <w:szCs w:val="27"/>
+          <w:bdr w:val="single" w:sz="2" w:space="0" w:color="1F1E1D" w:frame="1"/>
+          <w:lang w:eastAsia="en-GB"/>
+          <w14:ligatures w14:val="none"/>
+        </w:rPr>
+        <w:t>Final state:</w:t>
+      </w:r>
+    </w:p>
+    <w:p>
+      <w:pPr>
+        <w:numPr>
+          <w:ilvl w:val="0"/>
+          <w:numId w:val="7"/>
+        </w:numPr>
         <w:pBdr>
           <w:top w:val="single" w:sz="2" w:space="0" w:color="1F1E1D"/>
           <w:left w:val="single" w:sz="2" w:space="0" w:color="1F1E1D"/>
@@ -2786,27 +3126,141 @@
           <w:right w:val="single" w:sz="2" w:space="0" w:color="1F1E1D"/>
         </w:pBdr>
         <w:shd w:val="clear" w:color="auto" w:fill="FFFFFF"/>
-        <w:rPr>
-          <w:rFonts w:ascii="Segoe UI" w:eastAsia="Times New Roman" w:hAnsi="Segoe UI" w:cs="Segoe UI"/>
-          <w:color w:val="141413"/>
-          <w:kern w:val="0"/>
-          <w:sz w:val="21"/>
-          <w:szCs w:val="21"/>
-          <w:lang w:eastAsia="en-GB"/>
-          <w14:ligatures w14:val="none"/>
-        </w:rPr>
-      </w:pPr>
-      <w:r>
-        <w:rPr>
-          <w:rFonts w:ascii="Segoe UI" w:eastAsia="Times New Roman" w:hAnsi="Segoe UI" w:cs="Segoe UI"/>
-          <w:color w:val="141413"/>
-          <w:kern w:val="0"/>
-          <w:sz w:val="21"/>
-          <w:szCs w:val="21"/>
-          <w:lang w:eastAsia="en-GB"/>
-          <w14:ligatures w14:val="none"/>
-        </w:rPr>
-        <w:t>Packages already confirmed installed.</w:t>
+        <w:spacing w:before="100" w:beforeAutospacing="1" w:after="100" w:afterAutospacing="1"/>
+        <w:rPr>
+          <w:rFonts w:ascii="Segoe UI" w:eastAsia="Times New Roman" w:hAnsi="Segoe UI" w:cs="Segoe UI"/>
+          <w:color w:val="141413"/>
+          <w:kern w:val="0"/>
+          <w:sz w:val="27"/>
+          <w:szCs w:val="27"/>
+          <w:lang w:eastAsia="en-GB"/>
+          <w14:ligatures w14:val="none"/>
+        </w:rPr>
+      </w:pPr>
+      <w:r>
+        <w:rPr>
+          <w:rFonts w:ascii="Segoe UI" w:eastAsia="Times New Roman" w:hAnsi="Segoe UI" w:cs="Segoe UI"/>
+          <w:color w:val="141413"/>
+          <w:kern w:val="0"/>
+          <w:sz w:val="27"/>
+          <w:szCs w:val="27"/>
+          <w:lang w:eastAsia="en-GB"/>
+          <w14:ligatures w14:val="none"/>
+        </w:rPr>
+        <w:t>10,700+ tests, 0 failures across all 13 modules</w:t>
+      </w:r>
+    </w:p>
+    <w:p>
+      <w:pPr>
+        <w:numPr>
+          <w:ilvl w:val="0"/>
+          <w:numId w:val="7"/>
+        </w:numPr>
+        <w:pBdr>
+          <w:top w:val="single" w:sz="2" w:space="0" w:color="1F1E1D"/>
+          <w:left w:val="single" w:sz="2" w:space="0" w:color="1F1E1D"/>
+          <w:bottom w:val="single" w:sz="2" w:space="0" w:color="1F1E1D"/>
+          <w:right w:val="single" w:sz="2" w:space="0" w:color="1F1E1D"/>
+        </w:pBdr>
+        <w:shd w:val="clear" w:color="auto" w:fill="FFFFFF"/>
+        <w:spacing w:before="60"/>
+        <w:rPr>
+          <w:rFonts w:ascii="Segoe UI" w:eastAsia="Times New Roman" w:hAnsi="Segoe UI" w:cs="Segoe UI"/>
+          <w:color w:val="141413"/>
+          <w:kern w:val="0"/>
+          <w:sz w:val="27"/>
+          <w:szCs w:val="27"/>
+          <w:lang w:eastAsia="en-GB"/>
+          <w14:ligatures w14:val="none"/>
+        </w:rPr>
+      </w:pPr>
+      <w:r>
+        <w:rPr>
+          <w:rFonts w:ascii="Courier New" w:eastAsia="Times New Roman" w:hAnsi="Courier New" w:cs="Courier New"/>
+          <w:color w:val="8A2424"/>
+          <w:kern w:val="0"/>
+          <w:sz w:val="20"/>
+          <w:szCs w:val="20"/>
+          <w:bdr w:val="single" w:sz="2" w:space="0" w:color="auto" w:frame="1"/>
+          <w:lang w:eastAsia="en-GB"/>
+          <w14:ligatures w14:val="none"/>
+        </w:rPr>
+        <w:t>renv.lock</w:t>
+      </w:r>
+      <w:r>
+        <w:rPr>
+          <w:rFonts w:ascii="Segoe UI" w:eastAsia="Times New Roman" w:hAnsi="Segoe UI" w:cs="Segoe UI"/>
+          <w:color w:val="141413"/>
+          <w:kern w:val="0"/>
+          <w:sz w:val="27"/>
+          <w:szCs w:val="27"/>
+          <w:lang w:eastAsia="en-GB"/>
+          <w14:ligatures w14:val="none"/>
+        </w:rPr>
+        <w:t> snapshotted and committed</w:t>
+      </w:r>
+    </w:p>
+    <w:p>
+      <w:pPr>
+        <w:numPr>
+          <w:ilvl w:val="0"/>
+          <w:numId w:val="7"/>
+        </w:numPr>
+        <w:pBdr>
+          <w:top w:val="single" w:sz="2" w:space="0" w:color="1F1E1D"/>
+          <w:left w:val="single" w:sz="2" w:space="0" w:color="1F1E1D"/>
+          <w:bottom w:val="single" w:sz="2" w:space="0" w:color="1F1E1D"/>
+          <w:right w:val="single" w:sz="2" w:space="0" w:color="1F1E1D"/>
+        </w:pBdr>
+        <w:shd w:val="clear" w:color="auto" w:fill="FFFFFF"/>
+        <w:spacing w:before="60"/>
+        <w:rPr>
+          <w:rFonts w:ascii="Segoe UI" w:eastAsia="Times New Roman" w:hAnsi="Segoe UI" w:cs="Segoe UI"/>
+          <w:color w:val="141413"/>
+          <w:kern w:val="0"/>
+          <w:sz w:val="27"/>
+          <w:szCs w:val="27"/>
+          <w:lang w:eastAsia="en-GB"/>
+          <w14:ligatures w14:val="none"/>
+        </w:rPr>
+      </w:pPr>
+      <w:r>
+        <w:rPr>
+          <w:rFonts w:ascii="Courier New" w:eastAsia="Times New Roman" w:hAnsi="Courier New" w:cs="Courier New"/>
+          <w:color w:val="8A2424"/>
+          <w:kern w:val="0"/>
+          <w:sz w:val="20"/>
+          <w:szCs w:val="20"/>
+          <w:bdr w:val="single" w:sz="2" w:space="0" w:color="auto" w:frame="1"/>
+          <w:lang w:eastAsia="en-GB"/>
+          <w14:ligatures w14:val="none"/>
+        </w:rPr>
+        <w:t>feature/visual-polish</w:t>
+      </w:r>
+      <w:r>
+        <w:rPr>
+          <w:rFonts w:ascii="Segoe UI" w:eastAsia="Times New Roman" w:hAnsi="Segoe UI" w:cs="Segoe UI"/>
+          <w:color w:val="141413"/>
+          <w:kern w:val="0"/>
+          <w:sz w:val="27"/>
+          <w:szCs w:val="27"/>
+          <w:lang w:eastAsia="en-GB"/>
+          <w14:ligatures w14:val="none"/>
+        </w:rPr>
+        <w:t> merged to </w:t>
+      </w:r>
+      <w:r>
+        <w:rPr>
+          <w:rFonts w:ascii="Courier New" w:eastAsia="Times New Roman" w:hAnsi="Courier New" w:cs="Courier New"/>
+          <w:color w:val="8A2424"/>
+          <w:kern w:val="0"/>
+          <w:sz w:val="20"/>
+          <w:szCs w:val="20"/>
+          <w:bdr w:val="single" w:sz="2" w:space="0" w:color="auto" w:frame="1"/>
+          <w:lang w:eastAsia="en-GB"/>
+          <w14:ligatures w14:val="none"/>
+        </w:rPr>
+        <w:t>main</w:t>
       </w:r>
     </w:p>
     <w:p>
@@ -2823,101 +3277,206 @@
           <w:rFonts w:ascii="Segoe UI" w:eastAsia="Times New Roman" w:hAnsi="Segoe UI" w:cs="Segoe UI"/>
           <w:color w:val="141413"/>
           <w:kern w:val="0"/>
-          <w:sz w:val="21"/>
-          <w:szCs w:val="21"/>
-          <w:lang w:eastAsia="en-GB"/>
-          <w14:ligatures w14:val="none"/>
-        </w:rPr>
-      </w:pPr>
-      <w:r>
-        <w:rPr>
-          <w:rFonts w:ascii="Segoe UI" w:eastAsia="Times New Roman" w:hAnsi="Segoe UI" w:cs="Segoe UI"/>
-          <w:color w:val="141413"/>
-          <w:kern w:val="0"/>
-          <w:sz w:val="21"/>
-          <w:szCs w:val="21"/>
-          <w:lang w:eastAsia="en-GB"/>
-          <w14:ligatures w14:val="none"/>
-        </w:rPr>
-        <w:t>To answer your question — those 2 medium-priority items (</w:t>
-      </w:r>
-      <w:proofErr w:type="spellStart"/>
-      <w:r>
-        <w:rPr>
-          <w:rFonts w:ascii="Segoe UI" w:eastAsia="Times New Roman" w:hAnsi="Segoe UI" w:cs="Segoe UI"/>
-          <w:color w:val="141413"/>
-          <w:kern w:val="0"/>
-          <w:sz w:val="21"/>
-          <w:szCs w:val="21"/>
-          <w:lang w:eastAsia="en-GB"/>
-          <w14:ligatures w14:val="none"/>
-        </w:rPr>
-        <w:t>tryCatch</w:t>
-      </w:r>
-      <w:proofErr w:type="spellEnd"/>
-      <w:r>
-        <w:rPr>
-          <w:rFonts w:ascii="Segoe UI" w:eastAsia="Times New Roman" w:hAnsi="Segoe UI" w:cs="Segoe UI"/>
-          <w:color w:val="141413"/>
-          <w:kern w:val="0"/>
-          <w:sz w:val="21"/>
-          <w:szCs w:val="21"/>
-          <w:lang w:eastAsia="en-GB"/>
-          <w14:ligatures w14:val="none"/>
-        </w:rPr>
-        <w:t xml:space="preserve"> </w:t>
-      </w:r>
-      <w:proofErr w:type="spellStart"/>
-      <w:r>
-        <w:rPr>
-          <w:rFonts w:ascii="Segoe UI" w:eastAsia="Times New Roman" w:hAnsi="Segoe UI" w:cs="Segoe UI"/>
-          <w:color w:val="141413"/>
-          <w:kern w:val="0"/>
-          <w:sz w:val="21"/>
-          <w:szCs w:val="21"/>
-          <w:lang w:eastAsia="en-GB"/>
-          <w14:ligatures w14:val="none"/>
-        </w:rPr>
-        <w:t>stop→TRS</w:t>
-      </w:r>
-      <w:proofErr w:type="spellEnd"/>
-      <w:r>
-        <w:rPr>
-          <w:rFonts w:ascii="Segoe UI" w:eastAsia="Times New Roman" w:hAnsi="Segoe UI" w:cs="Segoe UI"/>
-          <w:color w:val="141413"/>
-          <w:kern w:val="0"/>
-          <w:sz w:val="21"/>
-          <w:szCs w:val="21"/>
-          <w:lang w:eastAsia="en-GB"/>
-          <w14:ligatures w14:val="none"/>
-        </w:rPr>
-        <w:t xml:space="preserve">, duplicate </w:t>
-      </w:r>
-      <w:proofErr w:type="spellStart"/>
-      <w:r>
-        <w:rPr>
-          <w:rFonts w:ascii="Segoe UI" w:eastAsia="Times New Roman" w:hAnsi="Segoe UI" w:cs="Segoe UI"/>
-          <w:color w:val="141413"/>
-          <w:kern w:val="0"/>
-          <w:sz w:val="21"/>
-          <w:szCs w:val="21"/>
-          <w:lang w:eastAsia="en-GB"/>
-          <w14:ligatures w14:val="none"/>
-        </w:rPr>
-        <w:t>functions→shared</w:t>
-      </w:r>
-      <w:proofErr w:type="spellEnd"/>
-      <w:r>
-        <w:rPr>
-          <w:rFonts w:ascii="Segoe UI" w:eastAsia="Times New Roman" w:hAnsi="Segoe UI" w:cs="Segoe UI"/>
-          <w:color w:val="141413"/>
-          <w:kern w:val="0"/>
-          <w:sz w:val="21"/>
-          <w:szCs w:val="21"/>
-          <w:lang w:eastAsia="en-GB"/>
-          <w14:ligatures w14:val="none"/>
-        </w:rPr>
-        <w:t>) are the only remaining refactoring. Want me to do them now?</w:t>
+          <w:sz w:val="27"/>
+          <w:szCs w:val="27"/>
+          <w:lang w:eastAsia="en-GB"/>
+          <w14:ligatures w14:val="none"/>
+        </w:rPr>
+      </w:pPr>
+      <w:r>
+        <w:rPr>
+          <w:rFonts w:ascii="Segoe UI" w:eastAsia="Times New Roman" w:hAnsi="Segoe UI" w:cs="Segoe UI"/>
+          <w:color w:val="141413"/>
+          <w:kern w:val="0"/>
+          <w:sz w:val="27"/>
+          <w:szCs w:val="27"/>
+          <w:lang w:eastAsia="en-GB"/>
+          <w14:ligatures w14:val="none"/>
+        </w:rPr>
+        <w:t>Nothing else is blocking. If you want to push further toward 95+, the remaining items from the earlier review would be:</w:t>
+      </w:r>
+    </w:p>
+    <w:p>
+      <w:pPr>
+        <w:numPr>
+          <w:ilvl w:val="0"/>
+          <w:numId w:val="8"/>
+        </w:numPr>
+        <w:pBdr>
+          <w:top w:val="single" w:sz="2" w:space="0" w:color="1F1E1D"/>
+          <w:left w:val="single" w:sz="2" w:space="0" w:color="1F1E1D"/>
+          <w:bottom w:val="single" w:sz="2" w:space="0" w:color="1F1E1D"/>
+          <w:right w:val="single" w:sz="2" w:space="0" w:color="1F1E1D"/>
+        </w:pBdr>
+        <w:shd w:val="clear" w:color="auto" w:fill="FFFFFF"/>
+        <w:spacing w:before="100" w:beforeAutospacing="1" w:after="100" w:afterAutospacing="1"/>
+        <w:rPr>
+          <w:rFonts w:ascii="Segoe UI" w:eastAsia="Times New Roman" w:hAnsi="Segoe UI" w:cs="Segoe UI"/>
+          <w:color w:val="141413"/>
+          <w:kern w:val="0"/>
+          <w:sz w:val="27"/>
+          <w:szCs w:val="27"/>
+          <w:lang w:eastAsia="en-GB"/>
+          <w14:ligatures w14:val="none"/>
+        </w:rPr>
+      </w:pPr>
+      <w:r>
+        <w:rPr>
+          <w:rFonts w:ascii="Segoe UI" w:eastAsia="Times New Roman" w:hAnsi="Segoe UI" w:cs="Segoe UI"/>
+          <w:color w:val="141413"/>
+          <w:kern w:val="0"/>
+          <w:sz w:val="27"/>
+          <w:szCs w:val="27"/>
+          <w:lang w:eastAsia="en-GB"/>
+          <w14:ligatures w14:val="none"/>
+        </w:rPr>
+        <w:t>Deeper test coverage for Confidence/Conjoint Excel output</w:t>
+      </w:r>
+    </w:p>
+    <w:p>
+      <w:pPr>
+        <w:numPr>
+          <w:ilvl w:val="0"/>
+          <w:numId w:val="8"/>
+        </w:numPr>
+        <w:pBdr>
+          <w:top w:val="single" w:sz="2" w:space="0" w:color="1F1E1D"/>
+          <w:left w:val="single" w:sz="2" w:space="0" w:color="1F1E1D"/>
+          <w:bottom w:val="single" w:sz="2" w:space="0" w:color="1F1E1D"/>
+          <w:right w:val="single" w:sz="2" w:space="0" w:color="1F1E1D"/>
+        </w:pBdr>
+        <w:shd w:val="clear" w:color="auto" w:fill="FFFFFF"/>
+        <w:spacing w:before="60"/>
+        <w:rPr>
+          <w:rFonts w:ascii="Segoe UI" w:eastAsia="Times New Roman" w:hAnsi="Segoe UI" w:cs="Segoe UI"/>
+          <w:color w:val="141413"/>
+          <w:kern w:val="0"/>
+          <w:sz w:val="27"/>
+          <w:szCs w:val="27"/>
+          <w:lang w:eastAsia="en-GB"/>
+          <w14:ligatures w14:val="none"/>
+        </w:rPr>
+      </w:pPr>
+      <w:r>
+        <w:rPr>
+          <w:rFonts w:ascii="Segoe UI" w:eastAsia="Times New Roman" w:hAnsi="Segoe UI" w:cs="Segoe UI"/>
+          <w:color w:val="141413"/>
+          <w:kern w:val="0"/>
+          <w:sz w:val="27"/>
+          <w:szCs w:val="27"/>
+          <w:lang w:eastAsia="en-GB"/>
+          <w14:ligatures w14:val="none"/>
+        </w:rPr>
+        <w:t>Consolidating duplicate utility functions into </w:t>
+      </w:r>
+      <w:r>
+        <w:rPr>
+          <w:rFonts w:ascii="Courier New" w:eastAsia="Times New Roman" w:hAnsi="Courier New" w:cs="Courier New"/>
+          <w:color w:val="8A2424"/>
+          <w:kern w:val="0"/>
+          <w:sz w:val="20"/>
+          <w:szCs w:val="20"/>
+          <w:bdr w:val="single" w:sz="2" w:space="0" w:color="auto" w:frame="1"/>
+          <w:lang w:eastAsia="en-GB"/>
+          <w14:ligatures w14:val="none"/>
+        </w:rPr>
+        <w:t>shared/</w:t>
+      </w:r>
+    </w:p>
+    <w:p>
+      <w:pPr>
+        <w:numPr>
+          <w:ilvl w:val="0"/>
+          <w:numId w:val="8"/>
+        </w:numPr>
+        <w:pBdr>
+          <w:top w:val="single" w:sz="2" w:space="0" w:color="1F1E1D"/>
+          <w:left w:val="single" w:sz="2" w:space="0" w:color="1F1E1D"/>
+          <w:bottom w:val="single" w:sz="2" w:space="0" w:color="1F1E1D"/>
+          <w:right w:val="single" w:sz="2" w:space="0" w:color="1F1E1D"/>
+        </w:pBdr>
+        <w:shd w:val="clear" w:color="auto" w:fill="FFFFFF"/>
+        <w:spacing w:before="60"/>
+        <w:rPr>
+          <w:rFonts w:ascii="Segoe UI" w:eastAsia="Times New Roman" w:hAnsi="Segoe UI" w:cs="Segoe UI"/>
+          <w:color w:val="141413"/>
+          <w:kern w:val="0"/>
+          <w:sz w:val="27"/>
+          <w:szCs w:val="27"/>
+          <w:lang w:eastAsia="en-GB"/>
+          <w14:ligatures w14:val="none"/>
+        </w:rPr>
+      </w:pPr>
+      <w:r>
+        <w:rPr>
+          <w:rFonts w:ascii="Segoe UI" w:eastAsia="Times New Roman" w:hAnsi="Segoe UI" w:cs="Segoe UI"/>
+          <w:color w:val="141413"/>
+          <w:kern w:val="0"/>
+          <w:sz w:val="27"/>
+          <w:szCs w:val="27"/>
+          <w:lang w:eastAsia="en-GB"/>
+          <w14:ligatures w14:val="none"/>
+        </w:rPr>
+        <w:lastRenderedPageBreak/>
+        <w:t>Converting remaining </w:t>
+      </w:r>
+      <w:r>
+        <w:rPr>
+          <w:rFonts w:ascii="Courier New" w:eastAsia="Times New Roman" w:hAnsi="Courier New" w:cs="Courier New"/>
+          <w:color w:val="8A2424"/>
+          <w:kern w:val="0"/>
+          <w:sz w:val="20"/>
+          <w:szCs w:val="20"/>
+          <w:bdr w:val="single" w:sz="2" w:space="0" w:color="auto" w:frame="1"/>
+          <w:lang w:eastAsia="en-GB"/>
+          <w14:ligatures w14:val="none"/>
+        </w:rPr>
+        <w:t>tryCatch(stop(...))</w:t>
+      </w:r>
+      <w:r>
+        <w:rPr>
+          <w:rFonts w:ascii="Segoe UI" w:eastAsia="Times New Roman" w:hAnsi="Segoe UI" w:cs="Segoe UI"/>
+          <w:color w:val="141413"/>
+          <w:kern w:val="0"/>
+          <w:sz w:val="27"/>
+          <w:szCs w:val="27"/>
+          <w:lang w:eastAsia="en-GB"/>
+          <w14:ligatures w14:val="none"/>
+        </w:rPr>
+        <w:t> patterns to TRS refusals</w:t>
+      </w:r>
+    </w:p>
+    <w:p>
+      <w:pPr>
+        <w:pBdr>
+          <w:top w:val="single" w:sz="2" w:space="0" w:color="1F1E1D"/>
+          <w:left w:val="single" w:sz="2" w:space="0" w:color="1F1E1D"/>
+          <w:bottom w:val="single" w:sz="2" w:space="0" w:color="1F1E1D"/>
+          <w:right w:val="single" w:sz="2" w:space="0" w:color="1F1E1D"/>
+        </w:pBdr>
+        <w:shd w:val="clear" w:color="auto" w:fill="FFFFFF"/>
+        <w:spacing w:before="120"/>
+        <w:rPr>
+          <w:rFonts w:ascii="Segoe UI" w:eastAsia="Times New Roman" w:hAnsi="Segoe UI" w:cs="Segoe UI"/>
+          <w:color w:val="141413"/>
+          <w:kern w:val="0"/>
+          <w:sz w:val="27"/>
+          <w:szCs w:val="27"/>
+          <w:lang w:eastAsia="en-GB"/>
+          <w14:ligatures w14:val="none"/>
+        </w:rPr>
+      </w:pPr>
+      <w:r>
+        <w:rPr>
+          <w:rFonts w:ascii="Segoe UI" w:eastAsia="Times New Roman" w:hAnsi="Segoe UI" w:cs="Segoe UI"/>
+          <w:color w:val="141413"/>
+          <w:kern w:val="0"/>
+          <w:sz w:val="27"/>
+          <w:szCs w:val="27"/>
+          <w:lang w:eastAsia="en-GB"/>
+          <w14:ligatures w14:val="none"/>
+        </w:rPr>
+        <w:t>But those are enhancements, not blockers. The platform is production-ready.</w:t>
       </w:r>
     </w:p>
     <w:p>
@@ -2940,6 +3499,304 @@
 <file path=word/numbering.xml><?xml version="1.0" encoding="utf-8"?>
 <w:numbering xmlns:wpc="http://schemas.microsoft.com/office/word/2010/wordprocessingCanvas" xmlns:cx="http://schemas.microsoft.com/office/drawing/2014/chartex" xmlns:cx1="http://schemas.microsoft.com/office/drawing/2015/9/8/chartex" xmlns:cx2="http://schemas.microsoft.com/office/drawing/2015/10/21/chartex" xmlns:cx3="http://schemas.microsoft.com/office/drawing/2016/5/9/chartex" xmlns:cx4="http://schemas.microsoft.com/office/drawing/2016/5/10/chartex" xmlns:cx5="http://schemas.microsoft.com/office/drawing/2016/5/11/chartex" xmlns:cx6="http://schemas.microsoft.com/office/drawing/2016/5/12/chartex" xmlns:cx7="http://schemas.microsoft.com/office/drawing/2016/5/13/chartex" xmlns:cx8="http://schemas.microsoft.com/office/drawing/2016/5/14/chartex" xmlns:mc="http://schemas.openxmlformats.org/markup-compatibility/2006" xmlns:aink="http://schemas.microsoft.com/office/drawing/2016/ink" xmlns:am3d="http://schemas.microsoft.com/office/drawing/2017/model3d" xmlns:o="urn:schemas-microsoft-com:office:office" xmlns:oel="http://schemas.microsoft.com/office/2019/extlst" xmlns:r="http://schemas.openxmlformats.org/officeDocument/2006/relationships" xmlns:m="http://schemas.openxmlformats.org/officeDocument/2006/math" xmlns:v="urn:schemas-microsoft-com:vml" xmlns:wp14="http://schemas.microsoft.com/office/word/2010/wordprocessingDrawing" xmlns:wp="http://schemas.openxmlformats.org/drawingml/2006/wordprocessingDrawing" xmlns:w10="urn:schemas-microsoft-com:office:word" xmlns:w="http://schemas.openxmlformats.org/wordprocessingml/2006/main" xmlns:w14="http://schemas.microsoft.com/office/word/2010/wordml" xmlns:w15="http://schemas.microsoft.com/office/word/2012/wordml" xmlns:w16cex="http://schemas.microsoft.com/office/word/2018/wordml/cex" xmlns:w16cid="http://schemas.microsoft.com/office/word/2016/wordml/cid" xmlns:w16="http://schemas.microsoft.com/office/word/2018/wordml" xmlns:w16du="http://schemas.microsoft.com/office/word/2023/wordml/word16du" xmlns:w16sdtdh="http://schemas.microsoft.com/office/word/2020/wordml/sdtdatahash" xmlns:w16sdtfl="http://schemas.microsoft.com/office/word/2024/wordml/sdtformatlock" xmlns:w16se="http://schemas.microsoft.com/office/word/2015/wordml/symex" xmlns:wpg="http://schemas.microsoft.com/office/word/2010/wordprocessingGroup" xmlns:wpi="http://schemas.microsoft.com/office/word/2010/wordprocessingInk" xmlns:wne="http://schemas.microsoft.com/office/word/2006/wordml" xmlns:wps="http://schemas.microsoft.com/office/word/2010/wordprocessingShape" mc:Ignorable="w14 w15 w16se w16cid w16 w16cex w16sdtdh w16sdtfl w16du wp14">
   <w:abstractNum w:abstractNumId="0" w15:restartNumberingAfterBreak="0">
+    <w:nsid w:val="07FE478D"/>
+    <w:multiLevelType w:val="multilevel"/>
+    <w:tmpl w:val="409AB7E0"/>
+    <w:lvl w:ilvl="0">
+      <w:start w:val="1"/>
+      <w:numFmt w:val="bullet"/>
+      <w:lvlText w:val=""/>
+      <w:lvlJc w:val="left"/>
+      <w:pPr>
+        <w:tabs>
+          <w:tab w:val="num" w:pos="720"/>
+        </w:tabs>
+        <w:ind w:left="720" w:hanging="360"/>
+      </w:pPr>
+      <w:rPr>
+        <w:rFonts w:ascii="Symbol" w:hAnsi="Symbol" w:hint="default"/>
+        <w:sz w:val="20"/>
+      </w:rPr>
+    </w:lvl>
+    <w:lvl w:ilvl="1" w:tentative="1">
+      <w:start w:val="1"/>
+      <w:numFmt w:val="bullet"/>
+      <w:lvlText w:val=""/>
+      <w:lvlJc w:val="left"/>
+      <w:pPr>
+        <w:tabs>
+          <w:tab w:val="num" w:pos="1440"/>
+        </w:tabs>
+        <w:ind w:left="1440" w:hanging="360"/>
+      </w:pPr>
+      <w:rPr>
+        <w:rFonts w:ascii="Symbol" w:hAnsi="Symbol" w:hint="default"/>
+        <w:sz w:val="20"/>
+      </w:rPr>
+    </w:lvl>
+    <w:lvl w:ilvl="2" w:tentative="1">
+      <w:start w:val="1"/>
+      <w:numFmt w:val="bullet"/>
+      <w:lvlText w:val=""/>
+      <w:lvlJc w:val="left"/>
+      <w:pPr>
+        <w:tabs>
+          <w:tab w:val="num" w:pos="2160"/>
+        </w:tabs>
+        <w:ind w:left="2160" w:hanging="360"/>
+      </w:pPr>
+      <w:rPr>
+        <w:rFonts w:ascii="Symbol" w:hAnsi="Symbol" w:hint="default"/>
+        <w:sz w:val="20"/>
+      </w:rPr>
+    </w:lvl>
+    <w:lvl w:ilvl="3" w:tentative="1">
+      <w:start w:val="1"/>
+      <w:numFmt w:val="bullet"/>
+      <w:lvlText w:val=""/>
+      <w:lvlJc w:val="left"/>
+      <w:pPr>
+        <w:tabs>
+          <w:tab w:val="num" w:pos="2880"/>
+        </w:tabs>
+        <w:ind w:left="2880" w:hanging="360"/>
+      </w:pPr>
+      <w:rPr>
+        <w:rFonts w:ascii="Symbol" w:hAnsi="Symbol" w:hint="default"/>
+        <w:sz w:val="20"/>
+      </w:rPr>
+    </w:lvl>
+    <w:lvl w:ilvl="4" w:tentative="1">
+      <w:start w:val="1"/>
+      <w:numFmt w:val="bullet"/>
+      <w:lvlText w:val=""/>
+      <w:lvlJc w:val="left"/>
+      <w:pPr>
+        <w:tabs>
+          <w:tab w:val="num" w:pos="3600"/>
+        </w:tabs>
+        <w:ind w:left="3600" w:hanging="360"/>
+      </w:pPr>
+      <w:rPr>
+        <w:rFonts w:ascii="Symbol" w:hAnsi="Symbol" w:hint="default"/>
+        <w:sz w:val="20"/>
+      </w:rPr>
+    </w:lvl>
+    <w:lvl w:ilvl="5" w:tentative="1">
+      <w:start w:val="1"/>
+      <w:numFmt w:val="bullet"/>
+      <w:lvlText w:val=""/>
+      <w:lvlJc w:val="left"/>
+      <w:pPr>
+        <w:tabs>
+          <w:tab w:val="num" w:pos="4320"/>
+        </w:tabs>
+        <w:ind w:left="4320" w:hanging="360"/>
+      </w:pPr>
+      <w:rPr>
+        <w:rFonts w:ascii="Symbol" w:hAnsi="Symbol" w:hint="default"/>
+        <w:sz w:val="20"/>
+      </w:rPr>
+    </w:lvl>
+    <w:lvl w:ilvl="6" w:tentative="1">
+      <w:start w:val="1"/>
+      <w:numFmt w:val="bullet"/>
+      <w:lvlText w:val=""/>
+      <w:lvlJc w:val="left"/>
+      <w:pPr>
+        <w:tabs>
+          <w:tab w:val="num" w:pos="5040"/>
+        </w:tabs>
+        <w:ind w:left="5040" w:hanging="360"/>
+      </w:pPr>
+      <w:rPr>
+        <w:rFonts w:ascii="Symbol" w:hAnsi="Symbol" w:hint="default"/>
+        <w:sz w:val="20"/>
+      </w:rPr>
+    </w:lvl>
+    <w:lvl w:ilvl="7" w:tentative="1">
+      <w:start w:val="1"/>
+      <w:numFmt w:val="bullet"/>
+      <w:lvlText w:val=""/>
+      <w:lvlJc w:val="left"/>
+      <w:pPr>
+        <w:tabs>
+          <w:tab w:val="num" w:pos="5760"/>
+        </w:tabs>
+        <w:ind w:left="5760" w:hanging="360"/>
+      </w:pPr>
+      <w:rPr>
+        <w:rFonts w:ascii="Symbol" w:hAnsi="Symbol" w:hint="default"/>
+        <w:sz w:val="20"/>
+      </w:rPr>
+    </w:lvl>
+    <w:lvl w:ilvl="8" w:tentative="1">
+      <w:start w:val="1"/>
+      <w:numFmt w:val="bullet"/>
+      <w:lvlText w:val=""/>
+      <w:lvlJc w:val="left"/>
+      <w:pPr>
+        <w:tabs>
+          <w:tab w:val="num" w:pos="6480"/>
+        </w:tabs>
+        <w:ind w:left="6480" w:hanging="360"/>
+      </w:pPr>
+      <w:rPr>
+        <w:rFonts w:ascii="Symbol" w:hAnsi="Symbol" w:hint="default"/>
+        <w:sz w:val="20"/>
+      </w:rPr>
+    </w:lvl>
+  </w:abstractNum>
+  <w:abstractNum w:abstractNumId="1" w15:restartNumberingAfterBreak="0">
+    <w:nsid w:val="0EE512D5"/>
+    <w:multiLevelType w:val="multilevel"/>
+    <w:tmpl w:val="7892E5CE"/>
+    <w:lvl w:ilvl="0">
+      <w:start w:val="1"/>
+      <w:numFmt w:val="bullet"/>
+      <w:lvlText w:val=""/>
+      <w:lvlJc w:val="left"/>
+      <w:pPr>
+        <w:tabs>
+          <w:tab w:val="num" w:pos="720"/>
+        </w:tabs>
+        <w:ind w:left="720" w:hanging="360"/>
+      </w:pPr>
+      <w:rPr>
+        <w:rFonts w:ascii="Symbol" w:hAnsi="Symbol" w:hint="default"/>
+        <w:sz w:val="20"/>
+      </w:rPr>
+    </w:lvl>
+    <w:lvl w:ilvl="1" w:tentative="1">
+      <w:start w:val="1"/>
+      <w:numFmt w:val="bullet"/>
+      <w:lvlText w:val=""/>
+      <w:lvlJc w:val="left"/>
+      <w:pPr>
+        <w:tabs>
+          <w:tab w:val="num" w:pos="1440"/>
+        </w:tabs>
+        <w:ind w:left="1440" w:hanging="360"/>
+      </w:pPr>
+      <w:rPr>
+        <w:rFonts w:ascii="Symbol" w:hAnsi="Symbol" w:hint="default"/>
+        <w:sz w:val="20"/>
+      </w:rPr>
+    </w:lvl>
+    <w:lvl w:ilvl="2" w:tentative="1">
+      <w:start w:val="1"/>
+      <w:numFmt w:val="bullet"/>
+      <w:lvlText w:val=""/>
+      <w:lvlJc w:val="left"/>
+      <w:pPr>
+        <w:tabs>
+          <w:tab w:val="num" w:pos="2160"/>
+        </w:tabs>
+        <w:ind w:left="2160" w:hanging="360"/>
+      </w:pPr>
+      <w:rPr>
+        <w:rFonts w:ascii="Symbol" w:hAnsi="Symbol" w:hint="default"/>
+        <w:sz w:val="20"/>
+      </w:rPr>
+    </w:lvl>
+    <w:lvl w:ilvl="3" w:tentative="1">
+      <w:start w:val="1"/>
+      <w:numFmt w:val="bullet"/>
+      <w:lvlText w:val=""/>
+      <w:lvlJc w:val="left"/>
+      <w:pPr>
+        <w:tabs>
+          <w:tab w:val="num" w:pos="2880"/>
+        </w:tabs>
+        <w:ind w:left="2880" w:hanging="360"/>
+      </w:pPr>
+      <w:rPr>
+        <w:rFonts w:ascii="Symbol" w:hAnsi="Symbol" w:hint="default"/>
+        <w:sz w:val="20"/>
+      </w:rPr>
+    </w:lvl>
+    <w:lvl w:ilvl="4" w:tentative="1">
+      <w:start w:val="1"/>
+      <w:numFmt w:val="bullet"/>
+      <w:lvlText w:val=""/>
+      <w:lvlJc w:val="left"/>
+      <w:pPr>
+        <w:tabs>
+          <w:tab w:val="num" w:pos="3600"/>
+        </w:tabs>
+        <w:ind w:left="3600" w:hanging="360"/>
+      </w:pPr>
+      <w:rPr>
+        <w:rFonts w:ascii="Symbol" w:hAnsi="Symbol" w:hint="default"/>
+        <w:sz w:val="20"/>
+      </w:rPr>
+    </w:lvl>
+    <w:lvl w:ilvl="5" w:tentative="1">
+      <w:start w:val="1"/>
+      <w:numFmt w:val="bullet"/>
+      <w:lvlText w:val=""/>
+      <w:lvlJc w:val="left"/>
+      <w:pPr>
+        <w:tabs>
+          <w:tab w:val="num" w:pos="4320"/>
+        </w:tabs>
+        <w:ind w:left="4320" w:hanging="360"/>
+      </w:pPr>
+      <w:rPr>
+        <w:rFonts w:ascii="Symbol" w:hAnsi="Symbol" w:hint="default"/>
+        <w:sz w:val="20"/>
+      </w:rPr>
+    </w:lvl>
+    <w:lvl w:ilvl="6" w:tentative="1">
+      <w:start w:val="1"/>
+      <w:numFmt w:val="bullet"/>
+      <w:lvlText w:val=""/>
+      <w:lvlJc w:val="left"/>
+      <w:pPr>
+        <w:tabs>
+          <w:tab w:val="num" w:pos="5040"/>
+        </w:tabs>
+        <w:ind w:left="5040" w:hanging="360"/>
+      </w:pPr>
+      <w:rPr>
+        <w:rFonts w:ascii="Symbol" w:hAnsi="Symbol" w:hint="default"/>
+        <w:sz w:val="20"/>
+      </w:rPr>
+    </w:lvl>
+    <w:lvl w:ilvl="7" w:tentative="1">
+      <w:start w:val="1"/>
+      <w:numFmt w:val="bullet"/>
+      <w:lvlText w:val=""/>
+      <w:lvlJc w:val="left"/>
+      <w:pPr>
+        <w:tabs>
+          <w:tab w:val="num" w:pos="5760"/>
+        </w:tabs>
+        <w:ind w:left="5760" w:hanging="360"/>
+      </w:pPr>
+      <w:rPr>
+        <w:rFonts w:ascii="Symbol" w:hAnsi="Symbol" w:hint="default"/>
+        <w:sz w:val="20"/>
+      </w:rPr>
+    </w:lvl>
+    <w:lvl w:ilvl="8" w:tentative="1">
+      <w:start w:val="1"/>
+      <w:numFmt w:val="bullet"/>
+      <w:lvlText w:val=""/>
+      <w:lvlJc w:val="left"/>
+      <w:pPr>
+        <w:tabs>
+          <w:tab w:val="num" w:pos="6480"/>
+        </w:tabs>
+        <w:ind w:left="6480" w:hanging="360"/>
+      </w:pPr>
+      <w:rPr>
+        <w:rFonts w:ascii="Symbol" w:hAnsi="Symbol" w:hint="default"/>
+        <w:sz w:val="20"/>
+      </w:rPr>
+    </w:lvl>
+  </w:abstractNum>
+  <w:abstractNum w:abstractNumId="2" w15:restartNumberingAfterBreak="0">
     <w:nsid w:val="1435798F"/>
     <w:multiLevelType w:val="multilevel"/>
     <w:tmpl w:val="72DE2438"/>
@@ -3088,7 +3945,7 @@
       </w:rPr>
     </w:lvl>
   </w:abstractNum>
-  <w:abstractNum w:abstractNumId="1" w15:restartNumberingAfterBreak="0">
+  <w:abstractNum w:abstractNumId="3" w15:restartNumberingAfterBreak="0">
     <w:nsid w:val="18441D44"/>
     <w:multiLevelType w:val="multilevel"/>
     <w:tmpl w:val="04685A2A"/>
@@ -3237,7 +4094,156 @@
       </w:rPr>
     </w:lvl>
   </w:abstractNum>
-  <w:abstractNum w:abstractNumId="2" w15:restartNumberingAfterBreak="0">
+  <w:abstractNum w:abstractNumId="4" w15:restartNumberingAfterBreak="0">
+    <w:nsid w:val="35874AE3"/>
+    <w:multiLevelType w:val="multilevel"/>
+    <w:tmpl w:val="7C7076F0"/>
+    <w:lvl w:ilvl="0">
+      <w:start w:val="1"/>
+      <w:numFmt w:val="bullet"/>
+      <w:lvlText w:val=""/>
+      <w:lvlJc w:val="left"/>
+      <w:pPr>
+        <w:tabs>
+          <w:tab w:val="num" w:pos="720"/>
+        </w:tabs>
+        <w:ind w:left="720" w:hanging="360"/>
+      </w:pPr>
+      <w:rPr>
+        <w:rFonts w:ascii="Symbol" w:hAnsi="Symbol" w:hint="default"/>
+        <w:sz w:val="20"/>
+      </w:rPr>
+    </w:lvl>
+    <w:lvl w:ilvl="1" w:tentative="1">
+      <w:start w:val="1"/>
+      <w:numFmt w:val="bullet"/>
+      <w:lvlText w:val=""/>
+      <w:lvlJc w:val="left"/>
+      <w:pPr>
+        <w:tabs>
+          <w:tab w:val="num" w:pos="1440"/>
+        </w:tabs>
+        <w:ind w:left="1440" w:hanging="360"/>
+      </w:pPr>
+      <w:rPr>
+        <w:rFonts w:ascii="Symbol" w:hAnsi="Symbol" w:hint="default"/>
+        <w:sz w:val="20"/>
+      </w:rPr>
+    </w:lvl>
+    <w:lvl w:ilvl="2" w:tentative="1">
+      <w:start w:val="1"/>
+      <w:numFmt w:val="bullet"/>
+      <w:lvlText w:val=""/>
+      <w:lvlJc w:val="left"/>
+      <w:pPr>
+        <w:tabs>
+          <w:tab w:val="num" w:pos="2160"/>
+        </w:tabs>
+        <w:ind w:left="2160" w:hanging="360"/>
+      </w:pPr>
+      <w:rPr>
+        <w:rFonts w:ascii="Symbol" w:hAnsi="Symbol" w:hint="default"/>
+        <w:sz w:val="20"/>
+      </w:rPr>
+    </w:lvl>
+    <w:lvl w:ilvl="3" w:tentative="1">
+      <w:start w:val="1"/>
+      <w:numFmt w:val="bullet"/>
+      <w:lvlText w:val=""/>
+      <w:lvlJc w:val="left"/>
+      <w:pPr>
+        <w:tabs>
+          <w:tab w:val="num" w:pos="2880"/>
+        </w:tabs>
+        <w:ind w:left="2880" w:hanging="360"/>
+      </w:pPr>
+      <w:rPr>
+        <w:rFonts w:ascii="Symbol" w:hAnsi="Symbol" w:hint="default"/>
+        <w:sz w:val="20"/>
+      </w:rPr>
+    </w:lvl>
+    <w:lvl w:ilvl="4" w:tentative="1">
+      <w:start w:val="1"/>
+      <w:numFmt w:val="bullet"/>
+      <w:lvlText w:val=""/>
+      <w:lvlJc w:val="left"/>
+      <w:pPr>
+        <w:tabs>
+          <w:tab w:val="num" w:pos="3600"/>
+        </w:tabs>
+        <w:ind w:left="3600" w:hanging="360"/>
+      </w:pPr>
+      <w:rPr>
+        <w:rFonts w:ascii="Symbol" w:hAnsi="Symbol" w:hint="default"/>
+        <w:sz w:val="20"/>
+      </w:rPr>
+    </w:lvl>
+    <w:lvl w:ilvl="5" w:tentative="1">
+      <w:start w:val="1"/>
+      <w:numFmt w:val="bullet"/>
+      <w:lvlText w:val=""/>
+      <w:lvlJc w:val="left"/>
+      <w:pPr>
+        <w:tabs>
+          <w:tab w:val="num" w:pos="4320"/>
+        </w:tabs>
+        <w:ind w:left="4320" w:hanging="360"/>
+      </w:pPr>
+      <w:rPr>
+        <w:rFonts w:ascii="Symbol" w:hAnsi="Symbol" w:hint="default"/>
+        <w:sz w:val="20"/>
+      </w:rPr>
+    </w:lvl>
+    <w:lvl w:ilvl="6" w:tentative="1">
+      <w:start w:val="1"/>
+      <w:numFmt w:val="bullet"/>
+      <w:lvlText w:val=""/>
+      <w:lvlJc w:val="left"/>
+      <w:pPr>
+        <w:tabs>
+          <w:tab w:val="num" w:pos="5040"/>
+        </w:tabs>
+        <w:ind w:left="5040" w:hanging="360"/>
+      </w:pPr>
+      <w:rPr>
+        <w:rFonts w:ascii="Symbol" w:hAnsi="Symbol" w:hint="default"/>
+        <w:sz w:val="20"/>
+      </w:rPr>
+    </w:lvl>
+    <w:lvl w:ilvl="7" w:tentative="1">
+      <w:start w:val="1"/>
+      <w:numFmt w:val="bullet"/>
+      <w:lvlText w:val=""/>
+      <w:lvlJc w:val="left"/>
+      <w:pPr>
+        <w:tabs>
+          <w:tab w:val="num" w:pos="5760"/>
+        </w:tabs>
+        <w:ind w:left="5760" w:hanging="360"/>
+      </w:pPr>
+      <w:rPr>
+        <w:rFonts w:ascii="Symbol" w:hAnsi="Symbol" w:hint="default"/>
+        <w:sz w:val="20"/>
+      </w:rPr>
+    </w:lvl>
+    <w:lvl w:ilvl="8" w:tentative="1">
+      <w:start w:val="1"/>
+      <w:numFmt w:val="bullet"/>
+      <w:lvlText w:val=""/>
+      <w:lvlJc w:val="left"/>
+      <w:pPr>
+        <w:tabs>
+          <w:tab w:val="num" w:pos="6480"/>
+        </w:tabs>
+        <w:ind w:left="6480" w:hanging="360"/>
+      </w:pPr>
+      <w:rPr>
+        <w:rFonts w:ascii="Symbol" w:hAnsi="Symbol" w:hint="default"/>
+        <w:sz w:val="20"/>
+      </w:rPr>
+    </w:lvl>
+  </w:abstractNum>
+  <w:abstractNum w:abstractNumId="5" w15:restartNumberingAfterBreak="0">
     <w:nsid w:val="619F632F"/>
     <w:multiLevelType w:val="multilevel"/>
     <w:tmpl w:val="03923BA2"/>
@@ -3386,7 +4392,7 @@
       </w:rPr>
     </w:lvl>
   </w:abstractNum>
-  <w:abstractNum w:abstractNumId="3" w15:restartNumberingAfterBreak="0">
+  <w:abstractNum w:abstractNumId="6" w15:restartNumberingAfterBreak="0">
     <w:nsid w:val="6B7F28B2"/>
     <w:multiLevelType w:val="multilevel"/>
     <w:tmpl w:val="F2A2C72C"/>
@@ -3535,7 +4541,7 @@
       </w:rPr>
     </w:lvl>
   </w:abstractNum>
-  <w:abstractNum w:abstractNumId="4" w15:restartNumberingAfterBreak="0">
+  <w:abstractNum w:abstractNumId="7" w15:restartNumberingAfterBreak="0">
     <w:nsid w:val="77136AAA"/>
     <w:multiLevelType w:val="multilevel"/>
     <w:tmpl w:val="A47235DE"/>
@@ -3685,18 +4691,27 @@
     </w:lvl>
   </w:abstractNum>
   <w:num w:numId="1" w16cid:durableId="140000339">
+    <w:abstractNumId w:val="5"/>
+  </w:num>
+  <w:num w:numId="2" w16cid:durableId="917203908">
+    <w:abstractNumId w:val="6"/>
+  </w:num>
+  <w:num w:numId="3" w16cid:durableId="1036464831">
+    <w:abstractNumId w:val="3"/>
+  </w:num>
+  <w:num w:numId="4" w16cid:durableId="1917008713">
+    <w:abstractNumId w:val="7"/>
+  </w:num>
+  <w:num w:numId="5" w16cid:durableId="1731422764">
     <w:abstractNumId w:val="2"/>
   </w:num>
-  <w:num w:numId="2" w16cid:durableId="917203908">
-    <w:abstractNumId w:val="3"/>
-  </w:num>
-  <w:num w:numId="3" w16cid:durableId="1036464831">
+  <w:num w:numId="6" w16cid:durableId="1316256063">
     <w:abstractNumId w:val="1"/>
   </w:num>
-  <w:num w:numId="4" w16cid:durableId="1917008713">
+  <w:num w:numId="7" w16cid:durableId="955597084">
     <w:abstractNumId w:val="4"/>
   </w:num>
-  <w:num w:numId="5" w16cid:durableId="1731422764">
+  <w:num w:numId="8" w16cid:durableId="1526090278">
     <w:abstractNumId w:val="0"/>
   </w:num>
 </w:numbering>

</xml_diff>